<commit_message>
resolution of the Data Acquisition Phase
</commit_message>
<xml_diff>
--- a/notes/Project_Notes.docx
+++ b/notes/Project_Notes.docx
@@ -226,6 +226,207 @@
           <w:bCs/>
         </w:rPr>
         <w:t xml:space="preserve"> Characterization</w:t>
+      </w:r>
+    </w:p>
+    <w:p>
+      <w:pPr>
+        <w:pStyle w:val="ListParagraph"/>
+        <w:numPr>
+          <w:ilvl w:val="0"/>
+          <w:numId w:val="2"/>
+        </w:numPr>
+      </w:pPr>
+      <w:r>
+        <w:t>Pre-</w:t>
+      </w:r>
+      <w:proofErr w:type="gramStart"/>
+      <w:r>
+        <w:t xml:space="preserve">processing </w:t>
+      </w:r>
+      <w:r>
+        <w:t xml:space="preserve"> 5</w:t>
+      </w:r>
+      <w:proofErr w:type="gramEnd"/>
+      <w:r>
+        <w:t xml:space="preserve"> </w:t>
+      </w:r>
+      <w:r>
+        <w:t>Single-Cell datasets with multipl</w:t>
+      </w:r>
+      <w:r>
+        <w:t xml:space="preserve">e </w:t>
+      </w:r>
+      <w:r>
+        <w:t xml:space="preserve">conditions (Healthy, Adjacent Normal, Tumor Core, Benign). </w:t>
+      </w:r>
+      <w:proofErr w:type="spellStart"/>
+      <w:r>
+        <w:t>MetaData</w:t>
+      </w:r>
+      <w:proofErr w:type="spellEnd"/>
+      <w:r>
+        <w:t xml:space="preserve"> will have to include the following columns</w:t>
+      </w:r>
+      <w:r>
+        <w:t xml:space="preserve"> at a minimum</w:t>
+      </w:r>
+      <w:r>
+        <w:t>:</w:t>
+      </w:r>
+    </w:p>
+    <w:p>
+      <w:pPr>
+        <w:rPr>
+          <w:b/>
+          <w:bCs/>
+        </w:rPr>
+      </w:pPr>
+    </w:p>
+    <w:p>
+      <w:pPr>
+        <w:rPr>
+          <w:b/>
+          <w:bCs/>
+        </w:rPr>
+      </w:pPr>
+    </w:p>
+    <w:p>
+      <w:pPr>
+        <w:rPr>
+          <w:b/>
+          <w:bCs/>
+        </w:rPr>
+      </w:pPr>
+    </w:p>
+    <w:p>
+      <w:pPr>
+        <w:rPr>
+          <w:b/>
+          <w:bCs/>
+        </w:rPr>
+      </w:pPr>
+    </w:p>
+    <w:p>
+      <w:pPr>
+        <w:rPr>
+          <w:b/>
+          <w:bCs/>
+        </w:rPr>
+      </w:pPr>
+      <w:r>
+        <w:rPr>
+          <w:b/>
+          <w:bCs/>
+        </w:rPr>
+        <w:lastRenderedPageBreak/>
+        <w:t>Final Sample Sheet</w:t>
+      </w:r>
+    </w:p>
+    <w:p>
+      <w:pPr>
+        <w:ind w:firstLine="720"/>
+      </w:pPr>
+      <w:r>
+        <w:br/>
+      </w:r>
+      <w:r>
+        <w:rPr>
+          <w:b/>
+          <w:bCs/>
+        </w:rPr>
+        <w:t>(</w:t>
+      </w:r>
+      <w:proofErr w:type="spellStart"/>
+      <w:proofErr w:type="gramStart"/>
+      <w:r>
+        <w:rPr>
+          <w:b/>
+          <w:bCs/>
+        </w:rPr>
+        <w:t>orig.ident</w:t>
+      </w:r>
+      <w:proofErr w:type="spellEnd"/>
+      <w:proofErr w:type="gramEnd"/>
+      <w:r>
+        <w:rPr>
+          <w:b/>
+          <w:bCs/>
+        </w:rPr>
+        <w:t xml:space="preserve">, </w:t>
+      </w:r>
+      <w:proofErr w:type="spellStart"/>
+      <w:r>
+        <w:rPr>
+          <w:b/>
+          <w:bCs/>
+        </w:rPr>
+        <w:t>geo_</w:t>
+      </w:r>
+      <w:proofErr w:type="gramStart"/>
+      <w:r>
+        <w:rPr>
+          <w:b/>
+          <w:bCs/>
+        </w:rPr>
+        <w:t>accession</w:t>
+      </w:r>
+      <w:proofErr w:type="spellEnd"/>
+      <w:r>
+        <w:rPr>
+          <w:b/>
+          <w:bCs/>
+        </w:rPr>
+        <w:t xml:space="preserve">,  </w:t>
+      </w:r>
+      <w:proofErr w:type="spellStart"/>
+      <w:r>
+        <w:rPr>
+          <w:b/>
+          <w:bCs/>
+        </w:rPr>
+        <w:t>sample</w:t>
+      </w:r>
+      <w:proofErr w:type="gramEnd"/>
+      <w:r>
+        <w:rPr>
+          <w:b/>
+          <w:bCs/>
+        </w:rPr>
+        <w:t>_title</w:t>
+      </w:r>
+      <w:proofErr w:type="spellEnd"/>
+      <w:r>
+        <w:rPr>
+          <w:b/>
+          <w:bCs/>
+        </w:rPr>
+        <w:t>, disease state of the sample</w:t>
+      </w:r>
+      <w:r>
+        <w:rPr>
+          <w:b/>
+          <w:bCs/>
+        </w:rPr>
+        <w:t xml:space="preserve">, </w:t>
+      </w:r>
+      <w:proofErr w:type="spellStart"/>
+      <w:r>
+        <w:rPr>
+          <w:b/>
+          <w:bCs/>
+        </w:rPr>
+        <w:t>patientID</w:t>
+      </w:r>
+      <w:proofErr w:type="spellEnd"/>
+      <w:r>
+        <w:rPr>
+          <w:b/>
+          <w:bCs/>
+        </w:rPr>
+        <w:t>)</w:t>
+      </w:r>
+      <w:r>
+        <w:t xml:space="preserve"> </w:t>
       </w:r>
     </w:p>
     <w:p>
@@ -237,143 +438,7 @@
         </w:numPr>
       </w:pPr>
       <w:r>
-        <w:t>Pre-</w:t>
-      </w:r>
-      <w:proofErr w:type="gramStart"/>
-      <w:r>
-        <w:t xml:space="preserve">processing </w:t>
-      </w:r>
-      <w:r>
-        <w:t xml:space="preserve"> 5</w:t>
-      </w:r>
-      <w:proofErr w:type="gramEnd"/>
-      <w:r>
-        <w:t xml:space="preserve"> </w:t>
-      </w:r>
-      <w:r>
-        <w:t>Single-Cell datasets with multipl</w:t>
-      </w:r>
-      <w:r>
-        <w:t xml:space="preserve">e </w:t>
-      </w:r>
-      <w:r>
-        <w:t xml:space="preserve">conditions (Healthy, Adjacent Normal, Tumor Core, Benign). </w:t>
-      </w:r>
-      <w:proofErr w:type="spellStart"/>
-      <w:r>
-        <w:t>MetaData</w:t>
-      </w:r>
-      <w:proofErr w:type="spellEnd"/>
-      <w:r>
-        <w:t xml:space="preserve"> will have to include the following columns</w:t>
-      </w:r>
-      <w:r>
-        <w:t xml:space="preserve"> at a minimum</w:t>
-      </w:r>
-      <w:r>
-        <w:t>:</w:t>
-      </w:r>
-      <w:r>
-        <w:br/>
-      </w:r>
-      <w:r>
-        <w:rPr>
-          <w:b/>
-          <w:bCs/>
-        </w:rPr>
-        <w:t>(</w:t>
-      </w:r>
-      <w:proofErr w:type="spellStart"/>
-      <w:proofErr w:type="gramStart"/>
-      <w:r>
-        <w:rPr>
-          <w:b/>
-          <w:bCs/>
-        </w:rPr>
-        <w:t>orig.ident</w:t>
-      </w:r>
-      <w:proofErr w:type="spellEnd"/>
-      <w:proofErr w:type="gramEnd"/>
-      <w:r>
-        <w:rPr>
-          <w:b/>
-          <w:bCs/>
-        </w:rPr>
-        <w:t xml:space="preserve">, </w:t>
-      </w:r>
-      <w:proofErr w:type="spellStart"/>
-      <w:r>
-        <w:rPr>
-          <w:b/>
-          <w:bCs/>
-        </w:rPr>
-        <w:t>geo_</w:t>
-      </w:r>
-      <w:proofErr w:type="gramStart"/>
-      <w:r>
-        <w:rPr>
-          <w:b/>
-          <w:bCs/>
-        </w:rPr>
-        <w:t>accession</w:t>
-      </w:r>
-      <w:proofErr w:type="spellEnd"/>
-      <w:r>
-        <w:rPr>
-          <w:b/>
-          <w:bCs/>
-        </w:rPr>
-        <w:t xml:space="preserve">,  </w:t>
-      </w:r>
-      <w:proofErr w:type="spellStart"/>
-      <w:r>
-        <w:rPr>
-          <w:b/>
-          <w:bCs/>
-        </w:rPr>
-        <w:t>sample</w:t>
-      </w:r>
-      <w:proofErr w:type="gramEnd"/>
-      <w:r>
-        <w:rPr>
-          <w:b/>
-          <w:bCs/>
-        </w:rPr>
-        <w:t>_title</w:t>
-      </w:r>
-      <w:proofErr w:type="spellEnd"/>
-      <w:r>
-        <w:rPr>
-          <w:b/>
-          <w:bCs/>
-        </w:rPr>
-        <w:t>, disease state of the sample</w:t>
-      </w:r>
-      <w:r>
-        <w:rPr>
-          <w:b/>
-          <w:bCs/>
-        </w:rPr>
-        <w:t xml:space="preserve">, </w:t>
-      </w:r>
-      <w:proofErr w:type="spellStart"/>
-      <w:r>
-        <w:rPr>
-          <w:b/>
-          <w:bCs/>
-        </w:rPr>
-        <w:t>patientID</w:t>
-      </w:r>
-      <w:proofErr w:type="spellEnd"/>
-      <w:r>
-        <w:rPr>
-          <w:b/>
-          <w:bCs/>
-        </w:rPr>
-        <w:t>)</w:t>
-      </w:r>
-      <w:r>
-        <w:t xml:space="preserve"> </w:t>
+        <w:t xml:space="preserve"> Quality Control of SC RNA-Seq datasets</w:t>
       </w:r>
     </w:p>
     <w:p>
@@ -385,7 +450,7 @@
         </w:numPr>
       </w:pPr>
       <w:r>
-        <w:t xml:space="preserve"> Quality Control of SC RNA-Seq datasets</w:t>
+        <w:t>Directly run Azimuth on each raw/normalized dataset using the Human Prostate or Human PBMC/Immune reference. Azimuth operates robustly at the individual dataset level.</w:t>
       </w:r>
     </w:p>
     <w:p>
@@ -397,7 +462,78 @@
         </w:numPr>
       </w:pPr>
       <w:r>
-        <w:t>Directly run Azimuth on each raw/normalized dataset using the Human Prostate or Human PBMC/Immune reference. Azimuth operates robustly at the individual dataset level.</w:t>
+        <w:t xml:space="preserve">Integration of </w:t>
+      </w:r>
+      <w:proofErr w:type="spellStart"/>
+      <w:r>
+        <w:t>scRNA</w:t>
+      </w:r>
+      <w:proofErr w:type="spellEnd"/>
+      <w:r>
+        <w:t>-Seq dataset</w:t>
+      </w:r>
+      <w:r>
+        <w:t xml:space="preserve"> to show the cell type stratifications and </w:t>
+      </w:r>
+      <w:proofErr w:type="spellStart"/>
+      <w:r>
+        <w:t>GeneMarkers</w:t>
+      </w:r>
+      <w:proofErr w:type="spellEnd"/>
+      <w:r>
+        <w:t xml:space="preserve"> for each condition, and sample.</w:t>
+      </w:r>
+    </w:p>
+    <w:p>
+      <w:pPr>
+        <w:pStyle w:val="ListParagraph"/>
+        <w:rPr>
+          <w:b/>
+          <w:bCs/>
+        </w:rPr>
+      </w:pPr>
+      <w:r>
+        <w:rPr>
+          <w:b/>
+          <w:bCs/>
+        </w:rPr>
+        <w:t xml:space="preserve">Q: What are cell type proportions per condition of single cell data and which markers can be used as identifying strata? </w:t>
+      </w:r>
+    </w:p>
+    <w:p>
+      <w:r>
+        <w:rPr>
+          <w:b/>
+          <w:bCs/>
+        </w:rPr>
+        <w:tab/>
+        <w:t>Input:</w:t>
+      </w:r>
+      <w:r>
+        <w:t xml:space="preserve"> 5 </w:t>
+      </w:r>
+      <w:proofErr w:type="spellStart"/>
+      <w:r>
+        <w:t>scRNA</w:t>
+      </w:r>
+      <w:proofErr w:type="spellEnd"/>
+      <w:r>
+        <w:t>-Seq datasets</w:t>
+      </w:r>
+    </w:p>
+    <w:p>
+      <w:r>
+        <w:tab/>
+      </w:r>
+      <w:r>
+        <w:rPr>
+          <w:b/>
+          <w:bCs/>
+        </w:rPr>
+        <w:t>Output:</w:t>
+      </w:r>
+      <w:r>
+        <w:t xml:space="preserve"> 1 Large Seurat Object, Clustered data after titration, UMAP, Gene Markers in between Annotated cell types for each condition.</w:t>
       </w:r>
     </w:p>
     <w:p>
@@ -409,79 +545,336 @@
         </w:numPr>
       </w:pPr>
       <w:r>
+        <w:t xml:space="preserve">Perform </w:t>
+      </w:r>
+      <w:proofErr w:type="spellStart"/>
+      <w:r>
+        <w:rPr>
+          <w:rStyle w:val="HTMLCode"/>
+          <w:rFonts w:eastAsiaTheme="majorEastAsia"/>
+        </w:rPr>
+        <w:t>FindMarkers</w:t>
+      </w:r>
+      <w:proofErr w:type="spellEnd"/>
+      <w:r>
+        <w:t xml:space="preserve"> / GO analysis </w:t>
+      </w:r>
+      <w:r>
+        <w:rPr>
+          <w:b/>
+          <w:bCs/>
+        </w:rPr>
+        <w:t>only once</w:t>
+      </w:r>
+      <w:r>
+        <w:t xml:space="preserve"> on the final, integrated dataset to validate Azimuth annotations or discover disease-specific novel sub-clusters (e.g., specialized TAMs or exhausted T cells).</w:t>
+      </w:r>
+    </w:p>
+    <w:p>
+      <w:pPr>
+        <w:rPr>
+          <w:b/>
+          <w:bCs/>
+        </w:rPr>
+      </w:pPr>
+      <w:r>
+        <w:rPr>
+          <w:b/>
+          <w:bCs/>
+        </w:rPr>
+        <w:t>Short Term Questions</w:t>
+      </w:r>
+    </w:p>
+    <w:p>
+      <w:pPr>
+        <w:ind w:left="720"/>
+      </w:pPr>
+      <w:r>
+        <w:t>Q1: Which cell types track with the disease states of prostate cancer?</w:t>
+      </w:r>
+    </w:p>
+    <w:p>
+      <w:pPr>
+        <w:ind w:firstLine="720"/>
+      </w:pPr>
+      <w:r>
+        <w:t>Q2: Do immune composition patterns differ between tumor core and adjacent normal tissue within the same patient?</w:t>
+      </w:r>
+    </w:p>
+    <w:p>
+      <w:pPr>
+        <w:rPr>
+          <w:b/>
+          <w:bCs/>
+        </w:rPr>
+      </w:pPr>
+      <w:r>
+        <w:rPr>
+          <w:b/>
+          <w:bCs/>
+        </w:rPr>
+        <w:t xml:space="preserve">Rationale for </w:t>
+      </w:r>
+      <w:proofErr w:type="gramStart"/>
+      <w:r>
+        <w:rPr>
+          <w:b/>
+          <w:bCs/>
+        </w:rPr>
+        <w:t>still keeping</w:t>
+      </w:r>
+      <w:proofErr w:type="gramEnd"/>
+      <w:r>
+        <w:rPr>
+          <w:b/>
+          <w:bCs/>
+        </w:rPr>
+        <w:t xml:space="preserve"> deconvolution</w:t>
+      </w:r>
+    </w:p>
+    <w:p>
+      <w:r>
+        <w:t>I found that</w:t>
+      </w:r>
+      <w:r>
+        <w:t xml:space="preserve"> most of the single cell data</w:t>
+      </w:r>
+      <w:r>
+        <w:t xml:space="preserve"> possess a volume of </w:t>
+      </w:r>
+      <w:r>
+        <w:t xml:space="preserve">clinical data. </w:t>
+      </w:r>
+      <w:proofErr w:type="gramStart"/>
+      <w:r>
+        <w:t>However</w:t>
+      </w:r>
+      <w:proofErr w:type="gramEnd"/>
+      <w:r>
+        <w:t xml:space="preserve"> the data is either</w:t>
+      </w:r>
+      <w:r>
+        <w:t xml:space="preserve"> sparse (not enough </w:t>
+      </w:r>
+      <w:r>
+        <w:t>coverage for all samples included within the dataset</w:t>
+      </w:r>
+      <w:r>
+        <w:t xml:space="preserve">), or inconsistent (not </w:t>
+      </w:r>
+      <w:proofErr w:type="gramStart"/>
+      <w:r>
+        <w:t>all of</w:t>
+      </w:r>
+      <w:proofErr w:type="gramEnd"/>
+      <w:r>
+        <w:t xml:space="preserve"> the same </w:t>
+      </w:r>
+      <w:r>
+        <w:t>clinical variable appears</w:t>
+      </w:r>
+      <w:r>
+        <w:t xml:space="preserve"> across all samples within the same dataset). To </w:t>
+      </w:r>
+      <w:r>
+        <w:t xml:space="preserve">compensate for </w:t>
+      </w:r>
+      <w:r>
+        <w:t xml:space="preserve">missing data or acquire consistent data </w:t>
+      </w:r>
+      <w:r>
+        <w:t xml:space="preserve">for a correlation analysis, </w:t>
+      </w:r>
+      <w:r>
+        <w:t>we can deconvolve cell types within</w:t>
+      </w:r>
+      <w:r>
+        <w:t xml:space="preserve"> </w:t>
+      </w:r>
+      <w:proofErr w:type="spellStart"/>
+      <w:r>
+        <w:t>bulkRNA</w:t>
+      </w:r>
+      <w:proofErr w:type="spellEnd"/>
+      <w:r>
+        <w:t>-Seq</w:t>
+      </w:r>
+      <w:r>
+        <w:t xml:space="preserve"> biopsies</w:t>
+      </w:r>
+      <w:r>
+        <w:t xml:space="preserve"> and use their paired clinical data</w:t>
+      </w:r>
+      <w:r>
+        <w:t xml:space="preserve">. </w:t>
+      </w:r>
+      <w:r>
+        <w:t xml:space="preserve">Additionally, </w:t>
+      </w:r>
+      <w:proofErr w:type="spellStart"/>
+      <w:r>
+        <w:t>scRNA</w:t>
+      </w:r>
+      <w:proofErr w:type="spellEnd"/>
+      <w:r>
+        <w:t xml:space="preserve">-Seq </w:t>
+      </w:r>
+      <w:r>
+        <w:t>clinical data are rarely married well, if at all, with single cell meta data once submitted to the GEO databases. This often comes with a lack of identifie</w:t>
+      </w:r>
+      <w:r>
+        <w:t>rs</w:t>
+      </w:r>
+      <w:r>
+        <w:t xml:space="preserve"> that tie</w:t>
+      </w:r>
+      <w:r>
+        <w:t>s to</w:t>
+      </w:r>
+      <w:r>
+        <w:t xml:space="preserve"> a single cell assay</w:t>
+      </w:r>
+      <w:r>
+        <w:t xml:space="preserve"> sample (GSMXXXXXX)</w:t>
+      </w:r>
+      <w:r>
+        <w:t>,</w:t>
+      </w:r>
+      <w:r>
+        <w:t xml:space="preserve"> identifiers </w:t>
+      </w:r>
+      <w:r>
+        <w:t>with original patient</w:t>
+      </w:r>
+      <w:r>
+        <w:t xml:space="preserve"> IDs and their paired clinical variables </w:t>
+      </w:r>
+      <w:r>
+        <w:t>(</w:t>
+      </w:r>
+      <w:proofErr w:type="spellStart"/>
+      <w:r>
+        <w:t>gleason</w:t>
+      </w:r>
+      <w:proofErr w:type="spellEnd"/>
+      <w:r>
+        <w:t xml:space="preserve"> </w:t>
+      </w:r>
+      <w:proofErr w:type="gramStart"/>
+      <w:r>
+        <w:t>scores,  PSA</w:t>
+      </w:r>
+      <w:proofErr w:type="gramEnd"/>
+      <w:r>
+        <w:t xml:space="preserve">, pathologic T, </w:t>
+      </w:r>
+      <w:proofErr w:type="spellStart"/>
+      <w:r>
+        <w:t>etc</w:t>
+      </w:r>
+      <w:proofErr w:type="spellEnd"/>
+      <w:r>
+        <w:t>)</w:t>
+      </w:r>
+      <w:r>
+        <w:t>, or different clinical variables measured between studies.</w:t>
+      </w:r>
+    </w:p>
+    <w:p>
+      <w:r>
+        <w:rPr>
+          <w:b/>
+          <w:bCs/>
+        </w:rPr>
         <w:lastRenderedPageBreak/>
-        <w:t xml:space="preserve">Integration of </w:t>
+        <w:t>Datasets with Clinical Data:</w:t>
+      </w:r>
+      <w:r>
+        <w:t xml:space="preserve"> GSE141445 (Chen et. al., 2021), GSE176031(Song, H, et. al., 2021), GSE150692(Crowley et. al., 2020), GSE18194(Chen, et. al. 2023),</w:t>
+      </w:r>
+      <w:r>
+        <w:t xml:space="preserve"> </w:t>
       </w:r>
       <w:proofErr w:type="spellStart"/>
       <w:r>
+        <w:t>SubSeries</w:t>
+      </w:r>
+      <w:proofErr w:type="spellEnd"/>
+      <w:r>
+        <w:t xml:space="preserve"> </w:t>
+      </w:r>
+      <w:r>
+        <w:t>GSE117403 (Henry et. al. 2018)</w:t>
+      </w:r>
+    </w:p>
+    <w:p>
+      <w:pPr>
+        <w:rPr>
+          <w:b/>
+          <w:bCs/>
+        </w:rPr>
+      </w:pPr>
+      <w:r>
+        <w:rPr>
+          <w:b/>
+          <w:bCs/>
+        </w:rPr>
+        <w:t xml:space="preserve">Part 2: </w:t>
+      </w:r>
+      <w:r>
+        <w:rPr>
+          <w:b/>
+          <w:bCs/>
+        </w:rPr>
+        <w:t xml:space="preserve">Cell Type Deconvolution on </w:t>
+      </w:r>
+      <w:proofErr w:type="spellStart"/>
+      <w:r>
+        <w:rPr>
+          <w:b/>
+          <w:bCs/>
+        </w:rPr>
+        <w:t>BulkRNA</w:t>
+      </w:r>
+      <w:proofErr w:type="spellEnd"/>
+      <w:r>
+        <w:rPr>
+          <w:b/>
+          <w:bCs/>
+        </w:rPr>
+        <w:t>-Seq Data</w:t>
+      </w:r>
+      <w:r>
+        <w:rPr>
+          <w:b/>
+          <w:bCs/>
+        </w:rPr>
+        <w:t>:</w:t>
+      </w:r>
+    </w:p>
+    <w:p>
+      <w:r>
+        <w:t xml:space="preserve">Rationale: </w:t>
+      </w:r>
+      <w:r>
+        <w:rPr>
+          <w:rStyle w:val="horizontal-container"/>
+        </w:rPr>
+        <w:t xml:space="preserve">Not all </w:t>
+      </w:r>
+      <w:proofErr w:type="spellStart"/>
+      <w:r>
+        <w:rPr>
+          <w:rStyle w:val="horizontal-container"/>
+        </w:rPr>
         <w:t>scRNA</w:t>
       </w:r>
       <w:proofErr w:type="spellEnd"/>
       <w:r>
-        <w:t>-Seq dataset</w:t>
-      </w:r>
-      <w:r>
-        <w:t xml:space="preserve"> to show the cell type stratifications and </w:t>
-      </w:r>
-      <w:proofErr w:type="spellStart"/>
-      <w:r>
-        <w:t>GeneMarkers</w:t>
-      </w:r>
-      <w:proofErr w:type="spellEnd"/>
-      <w:r>
-        <w:t xml:space="preserve"> for each condition, and sample.</w:t>
-      </w:r>
-    </w:p>
-    <w:p>
-      <w:pPr>
-        <w:pStyle w:val="ListParagraph"/>
-        <w:rPr>
-          <w:b/>
-          <w:bCs/>
-        </w:rPr>
-      </w:pPr>
-      <w:r>
-        <w:rPr>
-          <w:b/>
-          <w:bCs/>
-        </w:rPr>
-        <w:t xml:space="preserve">Q: What are cell type proportions per condition of single cell data and which markers can be used as identifying strata? </w:t>
-      </w:r>
-    </w:p>
-    <w:p>
-      <w:r>
-        <w:rPr>
-          <w:b/>
-          <w:bCs/>
-        </w:rPr>
-        <w:tab/>
-        <w:t>Input:</w:t>
-      </w:r>
-      <w:r>
-        <w:t xml:space="preserve"> 5 </w:t>
-      </w:r>
-      <w:proofErr w:type="spellStart"/>
-      <w:r>
-        <w:t>scRNA</w:t>
-      </w:r>
-      <w:proofErr w:type="spellEnd"/>
-      <w:r>
-        <w:t>-Seq datasets</w:t>
-      </w:r>
-    </w:p>
-    <w:p>
-      <w:r>
-        <w:tab/>
-      </w:r>
-      <w:r>
-        <w:rPr>
-          <w:b/>
-          <w:bCs/>
-        </w:rPr>
-        <w:t>Output:</w:t>
-      </w:r>
-      <w:r>
-        <w:t xml:space="preserve"> 1 Large Seurat Object, Clustered data after titration, UMAP, Gene Markers in between Annotated cell types for each condition.</w:t>
+        <w:rPr>
+          <w:rStyle w:val="horizontal-container"/>
+        </w:rPr>
+        <w:t>-Seq datasets have clinicals variables attached (Gleason, PSA, BCR).</w:t>
       </w:r>
     </w:p>
     <w:p>
@@ -493,304 +886,15 @@
         </w:numPr>
       </w:pPr>
       <w:r>
-        <w:t xml:space="preserve">Perform </w:t>
+        <w:t xml:space="preserve">Pre-process the </w:t>
       </w:r>
       <w:proofErr w:type="spellStart"/>
       <w:r>
-        <w:rPr>
-          <w:rStyle w:val="HTMLCode"/>
-          <w:rFonts w:eastAsiaTheme="majorEastAsia"/>
-        </w:rPr>
-        <w:t>FindMarkers</w:t>
+        <w:t>bulkRNA</w:t>
       </w:r>
       <w:proofErr w:type="spellEnd"/>
       <w:r>
-        <w:t xml:space="preserve"> / GO analysis </w:t>
-      </w:r>
-      <w:r>
-        <w:rPr>
-          <w:b/>
-          <w:bCs/>
-        </w:rPr>
-        <w:t>only once</w:t>
-      </w:r>
-      <w:r>
-        <w:t xml:space="preserve"> on the final, integrated dataset to validate Azimuth annotations or discover disease-specific novel sub-clusters (e.g., specialized TAMs or exhausted T cells).</w:t>
-      </w:r>
-    </w:p>
-    <w:p>
-      <w:pPr>
-        <w:rPr>
-          <w:b/>
-          <w:bCs/>
-        </w:rPr>
-      </w:pPr>
-      <w:r>
-        <w:rPr>
-          <w:b/>
-          <w:bCs/>
-        </w:rPr>
-        <w:t>Short Term Questions</w:t>
-      </w:r>
-    </w:p>
-    <w:p>
-      <w:pPr>
-        <w:ind w:left="720"/>
-      </w:pPr>
-      <w:r>
-        <w:t>Q1: Which cell types track with the disease states of prostate cancer?</w:t>
-      </w:r>
-    </w:p>
-    <w:p>
-      <w:pPr>
-        <w:ind w:firstLine="720"/>
-      </w:pPr>
-      <w:r>
-        <w:t>Q2: Do immune composition patterns differ between tumor core and adjacent normal tissue within the same patient?</w:t>
-      </w:r>
-    </w:p>
-    <w:p>
-      <w:r>
-        <w:t>I found that</w:t>
-      </w:r>
-      <w:r>
-        <w:t xml:space="preserve"> most of the single cell data</w:t>
-      </w:r>
-      <w:r>
-        <w:t xml:space="preserve"> possess a volume of </w:t>
-      </w:r>
-      <w:r>
-        <w:t xml:space="preserve">clinical data. </w:t>
-      </w:r>
-      <w:proofErr w:type="gramStart"/>
-      <w:r>
-        <w:t>However</w:t>
-      </w:r>
-      <w:proofErr w:type="gramEnd"/>
-      <w:r>
-        <w:t xml:space="preserve"> the data is either</w:t>
-      </w:r>
-      <w:r>
-        <w:t xml:space="preserve"> sparse (not enough </w:t>
-      </w:r>
-      <w:r>
-        <w:t>coverage for all samples included within the dataset</w:t>
-      </w:r>
-      <w:r>
-        <w:t xml:space="preserve">), or inconsistent (not </w:t>
-      </w:r>
-      <w:proofErr w:type="gramStart"/>
-      <w:r>
-        <w:t>all of</w:t>
-      </w:r>
-      <w:proofErr w:type="gramEnd"/>
-      <w:r>
-        <w:t xml:space="preserve"> the same </w:t>
-      </w:r>
-      <w:r>
-        <w:t>clinical variable appears</w:t>
-      </w:r>
-      <w:r>
-        <w:t xml:space="preserve"> across all samples within the same dataset). To </w:t>
-      </w:r>
-      <w:r>
-        <w:t xml:space="preserve">compensate for </w:t>
-      </w:r>
-      <w:r>
-        <w:t xml:space="preserve">missing data or acquire consistent data </w:t>
-      </w:r>
-      <w:r>
-        <w:t xml:space="preserve">for a correlation analysis, </w:t>
-      </w:r>
-      <w:r>
-        <w:t>we can deconvolve cell types within</w:t>
-      </w:r>
-      <w:r>
-        <w:t xml:space="preserve"> </w:t>
-      </w:r>
-      <w:proofErr w:type="spellStart"/>
-      <w:r>
-        <w:t>bulkRNA</w:t>
-      </w:r>
-      <w:proofErr w:type="spellEnd"/>
-      <w:r>
-        <w:t>-Seq</w:t>
-      </w:r>
-      <w:r>
-        <w:t xml:space="preserve"> biopsies</w:t>
-      </w:r>
-      <w:r>
-        <w:t xml:space="preserve"> and use their paired clinical data</w:t>
-      </w:r>
-      <w:r>
-        <w:t xml:space="preserve">. </w:t>
-      </w:r>
-      <w:r>
-        <w:t xml:space="preserve">Additionally, </w:t>
-      </w:r>
-      <w:proofErr w:type="spellStart"/>
-      <w:r>
-        <w:t>scRNA</w:t>
-      </w:r>
-      <w:proofErr w:type="spellEnd"/>
-      <w:r>
-        <w:t xml:space="preserve">-Seq </w:t>
-      </w:r>
-      <w:r>
-        <w:t>clinical data are rarely married well, if at all, with single cell meta data once submitted to the GEO databases. This often comes with a lack of identifie</w:t>
-      </w:r>
-      <w:r>
-        <w:t>rs</w:t>
-      </w:r>
-      <w:r>
-        <w:t xml:space="preserve"> that tie</w:t>
-      </w:r>
-      <w:r>
-        <w:t>s to</w:t>
-      </w:r>
-      <w:r>
-        <w:t xml:space="preserve"> a single cell assay</w:t>
-      </w:r>
-      <w:r>
-        <w:t xml:space="preserve"> sample (GSMXXXXXX)</w:t>
-      </w:r>
-      <w:r>
-        <w:t>,</w:t>
-      </w:r>
-      <w:r>
-        <w:t xml:space="preserve"> identifiers </w:t>
-      </w:r>
-      <w:r>
-        <w:t>with original patient</w:t>
-      </w:r>
-      <w:r>
-        <w:t xml:space="preserve"> IDs and their paired clinical variables </w:t>
-      </w:r>
-      <w:r>
-        <w:t>(</w:t>
-      </w:r>
-      <w:proofErr w:type="spellStart"/>
-      <w:r>
-        <w:t>gleason</w:t>
-      </w:r>
-      <w:proofErr w:type="spellEnd"/>
-      <w:r>
-        <w:t xml:space="preserve"> </w:t>
-      </w:r>
-      <w:proofErr w:type="gramStart"/>
-      <w:r>
-        <w:t>scores,  PSA</w:t>
-      </w:r>
-      <w:proofErr w:type="gramEnd"/>
-      <w:r>
-        <w:t xml:space="preserve">, pathologic T, </w:t>
-      </w:r>
-      <w:proofErr w:type="spellStart"/>
-      <w:r>
-        <w:t>etc</w:t>
-      </w:r>
-      <w:proofErr w:type="spellEnd"/>
-      <w:r>
-        <w:t>)</w:t>
-      </w:r>
-      <w:r>
-        <w:t>, or different clinical variables measured between studies.</w:t>
-      </w:r>
-    </w:p>
-    <w:p>
-      <w:r>
-        <w:rPr>
-          <w:b/>
-          <w:bCs/>
-        </w:rPr>
-        <w:t>Datasets with Clinical Data:</w:t>
-      </w:r>
-      <w:r>
-        <w:t xml:space="preserve"> GSE141445 (Chen et. al., 2021), GSE176031(Song, H, et. al., 2021), GSE150692(Crowley et. al., 2020), GSE18194(Chen, et. al. 2023),</w:t>
-      </w:r>
-      <w:r>
-        <w:t xml:space="preserve"> </w:t>
-      </w:r>
-      <w:proofErr w:type="spellStart"/>
-      <w:r>
-        <w:t>SubSeries</w:t>
-      </w:r>
-      <w:proofErr w:type="spellEnd"/>
-      <w:r>
-        <w:t xml:space="preserve"> </w:t>
-      </w:r>
-      <w:r>
-        <w:t>GSE117403 (Henry et. al. 2018).</w:t>
-      </w:r>
-    </w:p>
-    <w:p>
-      <w:pPr>
-        <w:rPr>
-          <w:b/>
-          <w:bCs/>
-        </w:rPr>
-      </w:pPr>
-      <w:r>
-        <w:rPr>
-          <w:b/>
-          <w:bCs/>
-        </w:rPr>
-        <w:t xml:space="preserve">Part 2: </w:t>
-      </w:r>
-      <w:r>
-        <w:rPr>
-          <w:b/>
-          <w:bCs/>
-        </w:rPr>
-        <w:t xml:space="preserve">Cell Type Deconvolution on </w:t>
-      </w:r>
-      <w:proofErr w:type="spellStart"/>
-      <w:r>
-        <w:rPr>
-          <w:b/>
-          <w:bCs/>
-        </w:rPr>
-        <w:t>BulkRNA</w:t>
-      </w:r>
-      <w:proofErr w:type="spellEnd"/>
-      <w:r>
-        <w:rPr>
-          <w:b/>
-          <w:bCs/>
-        </w:rPr>
-        <w:t>-Seq Data</w:t>
-      </w:r>
-      <w:r>
-        <w:rPr>
-          <w:b/>
-          <w:bCs/>
-        </w:rPr>
-        <w:t>:</w:t>
-      </w:r>
-    </w:p>
-    <w:p>
-      <w:r>
-        <w:t xml:space="preserve">Rationale: </w:t>
-      </w:r>
-      <w:r>
-        <w:rPr>
-          <w:rStyle w:val="horizontal-container"/>
-        </w:rPr>
-        <w:t xml:space="preserve">Not all </w:t>
-      </w:r>
-      <w:proofErr w:type="spellStart"/>
-      <w:r>
-        <w:rPr>
-          <w:rStyle w:val="horizontal-container"/>
-        </w:rPr>
-        <w:t>scRNA</w:t>
-      </w:r>
-      <w:proofErr w:type="spellEnd"/>
-      <w:r>
-        <w:rPr>
-          <w:rStyle w:val="horizontal-container"/>
-        </w:rPr>
-        <w:t>-Seq datasets have clinicals variables attached (Gleason, PSA, BCR).</w:t>
+        <w:t xml:space="preserve">-Seq data from TCGA-PRAD. </w:t>
       </w:r>
     </w:p>
     <w:p>
@@ -802,15 +906,39 @@
         </w:numPr>
       </w:pPr>
       <w:r>
-        <w:t xml:space="preserve">Pre-process the </w:t>
+        <w:t>Use the 5 individual pre-processed datasets as SCDC references for deconvolving the TCGA-PRAD data.</w:t>
+      </w:r>
+    </w:p>
+    <w:p>
+      <w:pPr>
+        <w:pStyle w:val="ListParagraph"/>
+      </w:pPr>
+      <w:r>
+        <w:t xml:space="preserve">Input: </w:t>
       </w:r>
       <w:proofErr w:type="spellStart"/>
       <w:r>
-        <w:t>bulkRNA</w:t>
+        <w:t>scRNA</w:t>
       </w:r>
       <w:proofErr w:type="spellEnd"/>
       <w:r>
-        <w:t xml:space="preserve">-Seq data from TCGA-PRAD. </w:t>
+        <w:t xml:space="preserve">-Seq Data + bulk </w:t>
+      </w:r>
+      <w:proofErr w:type="spellStart"/>
+      <w:r>
+        <w:t>RNASeq</w:t>
+      </w:r>
+      <w:proofErr w:type="spellEnd"/>
+      <w:r>
+        <w:t xml:space="preserve"> data w/ clinical Meta-Data</w:t>
+      </w:r>
+    </w:p>
+    <w:p>
+      <w:pPr>
+        <w:pStyle w:val="ListParagraph"/>
+      </w:pPr>
+      <w:r>
+        <w:t>Outputs: Proportion Matrices on the sample level</w:t>
       </w:r>
     </w:p>
     <w:p>
@@ -822,193 +950,293 @@
         </w:numPr>
       </w:pPr>
       <w:r>
-        <w:t>Use the 5 individual pre-processed datasets as SCDC references for deconvolving the TCGA-PRAD data.</w:t>
-      </w:r>
+        <w:t xml:space="preserve">Find </w:t>
+      </w:r>
+      <w:r>
+        <w:t>statistical</w:t>
+      </w:r>
+      <w:r>
+        <w:t xml:space="preserve"> </w:t>
+      </w:r>
+      <w:r>
+        <w:t>c</w:t>
+      </w:r>
+      <w:r>
+        <w:t>orrelations between the cell type</w:t>
+      </w:r>
+      <w:r>
+        <w:t xml:space="preserve"> proportions of the deconvolved bulk RNA-Seq data (Not Exactly sure on how to do that yet).</w:t>
+      </w:r>
+    </w:p>
+    <w:p>
+      <w:pPr>
+        <w:ind w:firstLine="720"/>
+      </w:pPr>
+      <w:r>
+        <w:rPr>
+          <w:b/>
+          <w:bCs/>
+        </w:rPr>
+        <w:t>Possible Outputs:</w:t>
+      </w:r>
+      <w:r>
+        <w:t xml:space="preserve"> a pairwise correlation matrix of all cell-type proportions; visualize as a heatmap</w:t>
+      </w:r>
+      <w:r>
+        <w:t>,</w:t>
+      </w:r>
+    </w:p>
+    <w:p>
+      <w:pPr>
+        <w:rPr>
+          <w:b/>
+          <w:bCs/>
+        </w:rPr>
+      </w:pPr>
+      <w:r>
+        <w:rPr>
+          <w:b/>
+          <w:bCs/>
+        </w:rPr>
+        <w:t>Short Term Questions</w:t>
+      </w:r>
+    </w:p>
+    <w:p>
+      <w:r>
+        <w:t>Q</w:t>
+      </w:r>
+      <w:r>
+        <w:t>1</w:t>
+      </w:r>
+      <w:r>
+        <w:t>: Which immune populations most strongly track with clinical risk? Are these associations consistent across dataset, or dataset-specific?</w:t>
+      </w:r>
+    </w:p>
+    <w:p>
+      <w:r>
+        <w:t xml:space="preserve">Q2: Are there T cell exhaustion </w:t>
+      </w:r>
+      <w:r>
+        <w:t>signature</w:t>
+      </w:r>
+      <w:r>
+        <w:t xml:space="preserve"> enrich in high-Gleason tumors, and does exhaustion score correlate with CD8 T cell abundance?</w:t>
+      </w:r>
+    </w:p>
+    <w:p>
+      <w:r>
+        <w:t>Q3: Does M1 and M2 like state shift in proportion to the Gleason score and does this polarization ratio predict recurrence better than total macrophage abundance?</w:t>
+      </w:r>
+    </w:p>
+    <w:p>
+      <w:r>
+        <w:t>https://gemini.google.com/app/bf55b47aff5d70fc</w:t>
+      </w:r>
+    </w:p>
+    <w:p>
+      <w:pPr>
+        <w:rPr>
+          <w:b/>
+          <w:bCs/>
+        </w:rPr>
+      </w:pPr>
+      <w:r>
+        <w:rPr>
+          <w:b/>
+          <w:bCs/>
+        </w:rPr>
+        <w:t>Part 1: Characterization ends</w:t>
+      </w:r>
+    </w:p>
+    <w:p>
+      <w:pPr>
+        <w:rPr>
+          <w:b/>
+          <w:bCs/>
+        </w:rPr>
+      </w:pPr>
+      <w:r>
+        <w:rPr>
+          <w:b/>
+          <w:bCs/>
+        </w:rPr>
+        <w:t>Big Questions</w:t>
+      </w:r>
+    </w:p>
+    <w:p>
+      <w:r>
+        <w:t>Do immune composition patterns differ between tumor core and adjacent normal tissue within the same patient, and does this vary with different clin</w:t>
+      </w:r>
+      <w:r>
+        <w:t>i</w:t>
+      </w:r>
+      <w:r>
+        <w:t>cal stages?</w:t>
+      </w:r>
+    </w:p>
+    <w:p>
+      <w:r>
+        <w:t>Can we identify a small panel of cell-type proportion features that classifies high-risk from low-risk patients with reasonable accuracy?</w:t>
+      </w:r>
+    </w:p>
+    <w:p>
+      <w:pPr>
+        <w:rPr>
+          <w:b/>
+          <w:bCs/>
+        </w:rPr>
+      </w:pPr>
     </w:p>
     <w:p>
       <w:pPr>
         <w:pStyle w:val="ListParagraph"/>
       </w:pPr>
-      <w:r>
+    </w:p>
+    <w:p>
+      <w:r>
+        <w:rPr>
+          <w:b/>
+          <w:bCs/>
+        </w:rPr>
         <w:lastRenderedPageBreak/>
-        <w:t xml:space="preserve">Input: </w:t>
+        <w:t>Datasets with Clinical Data:</w:t>
+      </w:r>
+      <w:r>
+        <w:t xml:space="preserve"> GSE141445 (Chen et. al., 2021), GSE176031(Song, H, et. al., 2021), GSE150692(Crowley et. al., 2020), GSE18194(Chen, et. al. 2023), </w:t>
       </w:r>
       <w:proofErr w:type="spellStart"/>
       <w:r>
-        <w:t>scRNA</w:t>
+        <w:t>SubSeries</w:t>
       </w:r>
       <w:proofErr w:type="spellEnd"/>
       <w:r>
-        <w:t xml:space="preserve">-Seq Data + bulk </w:t>
+        <w:t xml:space="preserve"> GSE117403 (Henry et. al. 2018)</w:t>
+      </w:r>
+    </w:p>
+    <w:p>
+      <w:pPr>
+        <w:rPr>
+          <w:b/>
+          <w:bCs/>
+        </w:rPr>
+      </w:pPr>
+      <w:r>
+        <w:rPr>
+          <w:b/>
+          <w:bCs/>
+        </w:rPr>
+        <w:t>Data Acquisition Summary</w:t>
+      </w:r>
+      <w:r>
+        <w:rPr>
+          <w:b/>
+          <w:bCs/>
+        </w:rPr>
+        <w:t xml:space="preserve"> (Materials and Methods)</w:t>
+      </w:r>
+    </w:p>
+    <w:p>
+      <w:r>
+        <w:t xml:space="preserve">Each single cell dataset and </w:t>
+      </w:r>
+      <w:r>
+        <w:t>its</w:t>
+      </w:r>
+      <w:r>
+        <w:t xml:space="preserve"> respective metadata was downloaded using tools provided by the </w:t>
       </w:r>
       <w:proofErr w:type="spellStart"/>
       <w:r>
-        <w:t>RNASeq</w:t>
+        <w:t>GEOquery</w:t>
       </w:r>
       <w:proofErr w:type="spellEnd"/>
       <w:r>
-        <w:t xml:space="preserve"> data w/ clinical Meta-Data</w:t>
-      </w:r>
-    </w:p>
-    <w:p>
-      <w:pPr>
-        <w:pStyle w:val="ListParagraph"/>
-      </w:pPr>
-      <w:r>
-        <w:t>Outputs: Proportion Matrices on the sample level</w:t>
-      </w:r>
-    </w:p>
-    <w:p>
-      <w:pPr>
-        <w:pStyle w:val="ListParagraph"/>
-        <w:numPr>
-          <w:ilvl w:val="0"/>
-          <w:numId w:val="1"/>
-        </w:numPr>
-      </w:pPr>
-      <w:r>
-        <w:t xml:space="preserve">Find </w:t>
-      </w:r>
-      <w:r>
-        <w:t>statistical</w:t>
-      </w:r>
-      <w:r>
-        <w:t xml:space="preserve"> </w:t>
-      </w:r>
-      <w:r>
-        <w:t>c</w:t>
-      </w:r>
-      <w:r>
-        <w:t>orrelations between the cell type</w:t>
-      </w:r>
-      <w:r>
-        <w:t xml:space="preserve"> proportions of the deconvolved bulk RNA-Seq data (Not Exactly sure on how to do that yet).</w:t>
-      </w:r>
-    </w:p>
-    <w:p>
-      <w:pPr>
-        <w:ind w:firstLine="720"/>
-      </w:pPr>
-      <w:r>
-        <w:rPr>
-          <w:b/>
-          <w:bCs/>
-        </w:rPr>
-        <w:t>Possible Outputs:</w:t>
-      </w:r>
-      <w:r>
-        <w:t xml:space="preserve"> a pairwise correlation matrix of all cell-type proportions; visualize as a heatmap</w:t>
-      </w:r>
-      <w:r>
-        <w:t>,</w:t>
-      </w:r>
-    </w:p>
-    <w:p>
-      <w:pPr>
-        <w:rPr>
-          <w:b/>
-          <w:bCs/>
-        </w:rPr>
-      </w:pPr>
-      <w:r>
-        <w:rPr>
-          <w:b/>
-          <w:bCs/>
-        </w:rPr>
-        <w:t>Short Term Questions</w:t>
-      </w:r>
-    </w:p>
-    <w:p>
-      <w:r>
-        <w:t>Q</w:t>
-      </w:r>
-      <w:r>
-        <w:t>1</w:t>
-      </w:r>
-      <w:r>
-        <w:t>: Which immune populations most strongly track with clinical risk? Are these associations consistent across dataset, or dataset-specific?</w:t>
-      </w:r>
-    </w:p>
-    <w:p>
-      <w:r>
-        <w:t xml:space="preserve">Q2: Are there T cell exhaustion </w:t>
-      </w:r>
-      <w:r>
-        <w:t>signature</w:t>
-      </w:r>
-      <w:r>
-        <w:t xml:space="preserve"> enrich in high-Gleason tumors, and does exhaustion score correlate with CD8 T cell abundance?</w:t>
-      </w:r>
-    </w:p>
-    <w:p>
-      <w:r>
-        <w:t>Q3: Does M1 and M2 like state shift in proportion to the Gleason score and does this polarization ratio predict recurrence better than total macrophage abundance?</w:t>
-      </w:r>
-    </w:p>
-    <w:p>
-      <w:r>
-        <w:t>https://gemini.google.com/app/bf55b47aff5d70fc</w:t>
-      </w:r>
-    </w:p>
-    <w:p>
-      <w:pPr>
-        <w:rPr>
-          <w:b/>
-          <w:bCs/>
-        </w:rPr>
-      </w:pPr>
-      <w:r>
-        <w:rPr>
-          <w:b/>
-          <w:bCs/>
-        </w:rPr>
-        <w:t>Part 1: Characterization ends</w:t>
-      </w:r>
-    </w:p>
-    <w:p>
-      <w:pPr>
-        <w:rPr>
-          <w:b/>
-          <w:bCs/>
-        </w:rPr>
-      </w:pPr>
-      <w:r>
-        <w:rPr>
-          <w:b/>
-          <w:bCs/>
-        </w:rPr>
-        <w:t>Big Questions</w:t>
-      </w:r>
-    </w:p>
-    <w:p>
-      <w:r>
-        <w:t>Do immune composition patterns differ between tumor core and adjacent normal tissue within the same patient, and does this vary with different clin</w:t>
-      </w:r>
-      <w:r>
-        <w:t>i</w:t>
-      </w:r>
-      <w:r>
-        <w:t>cal stages?</w:t>
-      </w:r>
-    </w:p>
-    <w:p>
-      <w:r>
-        <w:t>Can we identify a small panel of cell-type proportion features that classifies high-risk from low-risk patients with reasonable accuracy?</w:t>
-      </w:r>
-    </w:p>
-    <w:p>
-      <w:pPr>
-        <w:rPr>
-          <w:b/>
-          <w:bCs/>
-        </w:rPr>
-      </w:pPr>
-    </w:p>
-    <w:p>
-      <w:pPr>
-        <w:pStyle w:val="ListParagraph"/>
-      </w:pPr>
-    </w:p>
+        <w:t xml:space="preserve"> R librar</w:t>
+      </w:r>
+      <w:r>
+        <w:t xml:space="preserve">y then pre-processed with </w:t>
+      </w:r>
+      <w:proofErr w:type="spellStart"/>
+      <w:r>
+        <w:t>tidyverse</w:t>
+      </w:r>
+      <w:proofErr w:type="spellEnd"/>
+      <w:r>
+        <w:t>. Only human sourced prostat</w:t>
+      </w:r>
+      <w:r>
+        <w:t>e biopsy</w:t>
+      </w:r>
+      <w:r>
+        <w:t xml:space="preserve"> samples were used within this project</w:t>
+      </w:r>
+      <w:r>
+        <w:t>. D</w:t>
+      </w:r>
+      <w:r>
+        <w:t>atasets that feature</w:t>
+      </w:r>
+      <w:r>
+        <w:t xml:space="preserve">d a mixed </w:t>
+      </w:r>
+      <w:r>
+        <w:t>species assay collection (GSE150692)</w:t>
+      </w:r>
+      <w:r>
+        <w:t xml:space="preserve"> were filtered for only human assays</w:t>
+      </w:r>
+      <w:r>
+        <w:t>. Each</w:t>
+      </w:r>
+      <w:r>
+        <w:t xml:space="preserve"> dataset</w:t>
+      </w:r>
+      <w:r>
+        <w:t xml:space="preserve"> was chosen </w:t>
+      </w:r>
+      <w:r>
+        <w:t>based on</w:t>
+      </w:r>
+      <w:r>
+        <w:t xml:space="preserve"> conditions available (Healthy, Paired Adjacent Normal/Tumor Core) and lack of specific enrichments from the authors</w:t>
+      </w:r>
+      <w:r>
+        <w:t xml:space="preserve"> to avoid a skew in the upcoming analysis</w:t>
+      </w:r>
+      <w:r>
+        <w:t xml:space="preserve">. For example, </w:t>
+      </w:r>
+      <w:r>
+        <w:t>Kelvin Z. et. al., in Cell Reports 2021 “enriched for immune cells” within their biopsies enabling them to analyze direct view of the immune landscape for their in-depth analysis on the perturbation of immune states paired normal adjacent and tumo</w:t>
+      </w:r>
+      <w:r>
+        <w:t xml:space="preserve">r biopsies so this one was avoided. Cell columns with non-unique genes within the count matrix were summed together to create the Seurat object, while non-unique barcodes from different libraries of the same dataset were marked with </w:t>
+      </w:r>
+      <w:proofErr w:type="gramStart"/>
+      <w:r>
+        <w:t>a .i</w:t>
+      </w:r>
+      <w:proofErr w:type="gramEnd"/>
+      <w:r>
+        <w:t>+1 if authors had not already marked their library barcodes between samples to preserve library complexity.</w:t>
+      </w:r>
+    </w:p>
+    <w:p>
+      <w:pPr>
+        <w:rPr>
+          <w:b/>
+          <w:bCs/>
+        </w:rPr>
+      </w:pPr>
+      <w:r>
+        <w:rPr>
+          <w:b/>
+          <w:bCs/>
+        </w:rPr>
+        <w:t>Dataset QC (Materials and Methods)</w:t>
+      </w:r>
+    </w:p>
+    <w:p/>
     <w:p/>
     <w:p/>
     <w:sectPr>
@@ -1112,8 +1340,100 @@
       </w:pPr>
     </w:lvl>
   </w:abstractNum>
+  <w:abstractNum w:abstractNumId="1" w15:restartNumberingAfterBreak="0">
+    <w:nsid w:val="57410E7E"/>
+    <w:multiLevelType w:val="hybridMultilevel"/>
+    <w:tmpl w:val="D1E0371E"/>
+    <w:lvl w:ilvl="0" w:tplc="0409000F">
+      <w:start w:val="1"/>
+      <w:numFmt w:val="decimal"/>
+      <w:lvlText w:val="%1."/>
+      <w:lvlJc w:val="left"/>
+      <w:pPr>
+        <w:ind w:left="720" w:hanging="360"/>
+      </w:pPr>
+      <w:rPr>
+        <w:rFonts w:hint="default"/>
+      </w:rPr>
+    </w:lvl>
+    <w:lvl w:ilvl="1" w:tplc="04090019" w:tentative="1">
+      <w:start w:val="1"/>
+      <w:numFmt w:val="lowerLetter"/>
+      <w:lvlText w:val="%2."/>
+      <w:lvlJc w:val="left"/>
+      <w:pPr>
+        <w:ind w:left="1440" w:hanging="360"/>
+      </w:pPr>
+    </w:lvl>
+    <w:lvl w:ilvl="2" w:tplc="0409001B" w:tentative="1">
+      <w:start w:val="1"/>
+      <w:numFmt w:val="lowerRoman"/>
+      <w:lvlText w:val="%3."/>
+      <w:lvlJc w:val="right"/>
+      <w:pPr>
+        <w:ind w:left="2160" w:hanging="180"/>
+      </w:pPr>
+    </w:lvl>
+    <w:lvl w:ilvl="3" w:tplc="0409000F" w:tentative="1">
+      <w:start w:val="1"/>
+      <w:numFmt w:val="decimal"/>
+      <w:lvlText w:val="%4."/>
+      <w:lvlJc w:val="left"/>
+      <w:pPr>
+        <w:ind w:left="2880" w:hanging="360"/>
+      </w:pPr>
+    </w:lvl>
+    <w:lvl w:ilvl="4" w:tplc="04090019" w:tentative="1">
+      <w:start w:val="1"/>
+      <w:numFmt w:val="lowerLetter"/>
+      <w:lvlText w:val="%5."/>
+      <w:lvlJc w:val="left"/>
+      <w:pPr>
+        <w:ind w:left="3600" w:hanging="360"/>
+      </w:pPr>
+    </w:lvl>
+    <w:lvl w:ilvl="5" w:tplc="0409001B" w:tentative="1">
+      <w:start w:val="1"/>
+      <w:numFmt w:val="lowerRoman"/>
+      <w:lvlText w:val="%6."/>
+      <w:lvlJc w:val="right"/>
+      <w:pPr>
+        <w:ind w:left="4320" w:hanging="180"/>
+      </w:pPr>
+    </w:lvl>
+    <w:lvl w:ilvl="6" w:tplc="0409000F" w:tentative="1">
+      <w:start w:val="1"/>
+      <w:numFmt w:val="decimal"/>
+      <w:lvlText w:val="%7."/>
+      <w:lvlJc w:val="left"/>
+      <w:pPr>
+        <w:ind w:left="5040" w:hanging="360"/>
+      </w:pPr>
+    </w:lvl>
+    <w:lvl w:ilvl="7" w:tplc="04090019" w:tentative="1">
+      <w:start w:val="1"/>
+      <w:numFmt w:val="lowerLetter"/>
+      <w:lvlText w:val="%8."/>
+      <w:lvlJc w:val="left"/>
+      <w:pPr>
+        <w:ind w:left="5760" w:hanging="360"/>
+      </w:pPr>
+    </w:lvl>
+    <w:lvl w:ilvl="8" w:tplc="0409001B" w:tentative="1">
+      <w:start w:val="1"/>
+      <w:numFmt w:val="lowerRoman"/>
+      <w:lvlText w:val="%9."/>
+      <w:lvlJc w:val="right"/>
+      <w:pPr>
+        <w:ind w:left="6480" w:hanging="180"/>
+      </w:pPr>
+    </w:lvl>
+  </w:abstractNum>
   <w:num w:numId="1" w16cid:durableId="368184092">
     <w:abstractNumId w:val="0"/>
+  </w:num>
+  <w:num w:numId="2" w16cid:durableId="919100901">
+    <w:abstractNumId w:val="1"/>
   </w:num>
 </w:numbering>
 </file>
@@ -2053,6 +2373,25 @@
       <w:szCs w:val="20"/>
     </w:rPr>
   </w:style>
+  <w:style w:type="table" w:styleId="TableGrid">
+    <w:name w:val="Table Grid"/>
+    <w:basedOn w:val="TableNormal"/>
+    <w:uiPriority w:val="39"/>
+    <w:rsid w:val="00112F6E"/>
+    <w:pPr>
+      <w:spacing w:after="0" w:line="240" w:lineRule="auto"/>
+    </w:pPr>
+    <w:tblPr>
+      <w:tblBorders>
+        <w:top w:val="single" w:sz="4" w:space="0" w:color="auto"/>
+        <w:left w:val="single" w:sz="4" w:space="0" w:color="auto"/>
+        <w:bottom w:val="single" w:sz="4" w:space="0" w:color="auto"/>
+        <w:right w:val="single" w:sz="4" w:space="0" w:color="auto"/>
+        <w:insideH w:val="single" w:sz="4" w:space="0" w:color="auto"/>
+        <w:insideV w:val="single" w:sz="4" w:space="0" w:color="auto"/>
+      </w:tblBorders>
+    </w:tblPr>
+  </w:style>
 </w:styles>
 </file>
 

</xml_diff>

<commit_message>
At integration taking a short break
</commit_message>
<xml_diff>
--- a/notes/Project_Notes.docx
+++ b/notes/Project_Notes.docx
@@ -898,32 +898,6 @@
       </w:r>
     </w:p>
     <w:p>
-      <w:r>
-        <w:rPr>
-          <w:b/>
-          <w:bCs/>
-        </w:rPr>
-        <w:t>Datasets with Clinical Data:</w:t>
-      </w:r>
-      <w:r>
-        <w:t xml:space="preserve"> GSE141445 (Chen et. al., 2021), GSE176031(Song, H, et. al., 2021), GSE150692(Crowley et. al., 2020), GSE18194(Chen, et. al. 2023),</w:t>
-      </w:r>
-      <w:r>
-        <w:t xml:space="preserve"> </w:t>
-      </w:r>
-      <w:proofErr w:type="spellStart"/>
-      <w:r>
-        <w:t>SubSeries</w:t>
-      </w:r>
-      <w:proofErr w:type="spellEnd"/>
-      <w:r>
-        <w:t xml:space="preserve"> </w:t>
-      </w:r>
-      <w:r>
-        <w:t>GSE117403 (Henry et. al. 2018)</w:t>
-      </w:r>
-    </w:p>
-    <w:p>
       <w:pPr>
         <w:rPr>
           <w:b/>
@@ -1030,7 +1004,6 @@
         <w:pStyle w:val="ListParagraph"/>
       </w:pPr>
       <w:r>
-        <w:lastRenderedPageBreak/>
         <w:t xml:space="preserve">Input: </w:t>
       </w:r>
       <w:proofErr w:type="spellStart"/>
@@ -1094,6 +1067,7 @@
           <w:b/>
           <w:bCs/>
         </w:rPr>
+        <w:lastRenderedPageBreak/>
         <w:t>Possible Outputs:</w:t>
       </w:r>
       <w:r>
@@ -1146,11 +1120,6 @@
       </w:r>
     </w:p>
     <w:p>
-      <w:r>
-        <w:t>https://gemini.google.com/app/bf55b47aff5d70fc</w:t>
-      </w:r>
-    </w:p>
-    <w:p>
       <w:pPr>
         <w:rPr>
           <w:b/>
@@ -1197,24 +1166,76 @@
       </w:r>
     </w:p>
     <w:p>
-      <w:r>
-        <w:rPr>
-          <w:b/>
-          <w:bCs/>
-        </w:rPr>
-        <w:t>Datasets with Clinical Data:</w:t>
-      </w:r>
-      <w:r>
-        <w:t xml:space="preserve"> GSE141445 (Chen et. al., 2021), GSE176031(Song, H, et. al., 2021), GSE150692(Crowley et. al., 2020), GSE18194(Chen, et. al. 2023), </w:t>
-      </w:r>
-      <w:proofErr w:type="spellStart"/>
-      <w:r>
-        <w:t>SubSeries</w:t>
-      </w:r>
-      <w:proofErr w:type="spellEnd"/>
-      <w:r>
-        <w:t xml:space="preserve"> GSE117403 (Henry et. al. 2018)</w:t>
-      </w:r>
+      <w:pPr>
+        <w:rPr>
+          <w:b/>
+          <w:bCs/>
+        </w:rPr>
+      </w:pPr>
+    </w:p>
+    <w:p>
+      <w:pPr>
+        <w:rPr>
+          <w:b/>
+          <w:bCs/>
+        </w:rPr>
+      </w:pPr>
+    </w:p>
+    <w:p>
+      <w:pPr>
+        <w:rPr>
+          <w:b/>
+          <w:bCs/>
+        </w:rPr>
+      </w:pPr>
+    </w:p>
+    <w:p>
+      <w:pPr>
+        <w:rPr>
+          <w:b/>
+          <w:bCs/>
+        </w:rPr>
+      </w:pPr>
+    </w:p>
+    <w:p>
+      <w:pPr>
+        <w:rPr>
+          <w:b/>
+          <w:bCs/>
+        </w:rPr>
+      </w:pPr>
+    </w:p>
+    <w:p>
+      <w:pPr>
+        <w:rPr>
+          <w:b/>
+          <w:bCs/>
+        </w:rPr>
+      </w:pPr>
+    </w:p>
+    <w:p>
+      <w:pPr>
+        <w:rPr>
+          <w:b/>
+          <w:bCs/>
+        </w:rPr>
+      </w:pPr>
+    </w:p>
+    <w:p>
+      <w:pPr>
+        <w:rPr>
+          <w:b/>
+          <w:bCs/>
+        </w:rPr>
+      </w:pPr>
+    </w:p>
+    <w:p>
+      <w:pPr>
+        <w:rPr>
+          <w:b/>
+          <w:bCs/>
+        </w:rPr>
+      </w:pPr>
     </w:p>
     <w:p>
       <w:pPr>
@@ -1295,7 +1316,11 @@
         <w:t xml:space="preserve"> dataset</w:t>
       </w:r>
       <w:r>
-        <w:t xml:space="preserve"> was chosen </w:t>
+        <w:t xml:space="preserve"> was </w:t>
+      </w:r>
+      <w:r>
+        <w:lastRenderedPageBreak/>
+        <w:t xml:space="preserve">chosen </w:t>
       </w:r>
       <w:r>
         <w:t>based on</w:t>
@@ -1310,533 +1335,491 @@
         <w:t xml:space="preserve">. For example, </w:t>
       </w:r>
       <w:r>
-        <w:t xml:space="preserve">Kelvin Z. et. al., in Cell Reports 2021 “enriched for immune cells” within their biopsies enabling them to analyze direct view of the immune landscape for their in-depth </w:t>
+        <w:t>Kelvin Z. et. al., in Cell Reports 2021 “enriched for immune cells” within their biopsies enabling them to analyze direct view of the immune landscape for their in-depth analysis on the perturbation of immune states paired normal adjacent and tumo</w:t>
+      </w:r>
+      <w:r>
+        <w:t xml:space="preserve">r biopsies so this one was avoided. Cell columns with non-unique genes within the count matrix were summed together to create the Seurat object, while non-unique barcodes from different libraries of the same dataset were marked with </w:t>
+      </w:r>
+      <w:proofErr w:type="gramStart"/>
+      <w:r>
+        <w:t>a .i</w:t>
+      </w:r>
+      <w:proofErr w:type="gramEnd"/>
+      <w:r>
+        <w:t>+1 if authors had not already marked their library barcodes between samples to preserve library complexity.</w:t>
+      </w:r>
+    </w:p>
+    <w:p>
+      <w:pPr>
+        <w:rPr>
+          <w:b/>
+          <w:bCs/>
+        </w:rPr>
+      </w:pPr>
+      <w:r>
+        <w:rPr>
+          <w:b/>
+          <w:bCs/>
+        </w:rPr>
+        <w:t xml:space="preserve">Dataset Cell </w:t>
+      </w:r>
+      <w:r>
+        <w:rPr>
+          <w:b/>
+          <w:bCs/>
+        </w:rPr>
+        <w:t>QC (Materials and Methods)</w:t>
+      </w:r>
+      <w:r>
+        <w:rPr>
+          <w:b/>
+          <w:bCs/>
+        </w:rPr>
+        <w:t xml:space="preserve"> [This paragraph has redundancies]</w:t>
+      </w:r>
+    </w:p>
+    <w:p>
+      <w:r>
+        <w:t>Each dataset was first screened using</w:t>
+      </w:r>
+      <w:r>
+        <w:t xml:space="preserve"> the</w:t>
+      </w:r>
+      <w:r>
+        <w:t xml:space="preserve"> </w:t>
+      </w:r>
+      <w:proofErr w:type="spellStart"/>
+      <w:r>
+        <w:t>EmptyDroplets</w:t>
+      </w:r>
+      <w:proofErr w:type="spellEnd"/>
+      <w:r>
+        <w:t xml:space="preserve"> from </w:t>
+      </w:r>
+      <w:proofErr w:type="spellStart"/>
+      <w:r>
+        <w:t>DropletUtils</w:t>
+      </w:r>
+      <w:proofErr w:type="spellEnd"/>
+      <w:r>
+        <w:t xml:space="preserve"> [1, 2] and the </w:t>
+      </w:r>
+      <w:proofErr w:type="spellStart"/>
+      <w:r>
+        <w:t>DoubletFinder</w:t>
+      </w:r>
+      <w:proofErr w:type="spellEnd"/>
+      <w:r>
+        <w:t xml:space="preserve"> classifier [3] to determine </w:t>
+      </w:r>
+      <w:r>
+        <w:t xml:space="preserve">whether to what extent </w:t>
+      </w:r>
+      <w:r>
+        <w:t>manual</w:t>
+      </w:r>
+      <w:r>
+        <w:t xml:space="preserve"> filtering </w:t>
+      </w:r>
+      <w:r>
+        <w:t xml:space="preserve">thresholds would be applied to the </w:t>
+      </w:r>
+      <w:proofErr w:type="spellStart"/>
+      <w:r>
+        <w:t>nFeature</w:t>
+      </w:r>
+      <w:proofErr w:type="spellEnd"/>
+      <w:r>
+        <w:t xml:space="preserve"> and </w:t>
+      </w:r>
+      <w:proofErr w:type="spellStart"/>
+      <w:r>
+        <w:t>nCount</w:t>
+      </w:r>
+      <w:proofErr w:type="spellEnd"/>
+      <w:r>
+        <w:t xml:space="preserve"> </w:t>
+      </w:r>
+      <w:r>
+        <w:t>metrics after creating routine scatter plots</w:t>
+      </w:r>
+      <w:r>
+        <w:t>.</w:t>
+      </w:r>
+      <w:r>
+        <w:t xml:space="preserve"> </w:t>
+      </w:r>
+      <w:r>
+        <w:t>This process established expected proportions of doublets and empty droplets within the single-cell dat</w:t>
+      </w:r>
+      <w:r>
+        <w:t>a and inform the magnitude of the manual thresholds</w:t>
+      </w:r>
+      <w:r>
+        <w:t>. To answer if quality control was necessary within the acquired data</w:t>
+      </w:r>
+      <w:r>
+        <w:t>,</w:t>
+      </w:r>
+      <w:r>
+        <w:t xml:space="preserve"> each dataset </w:t>
+      </w:r>
+      <w:r>
+        <w:t>that was either stated to have been pre-processed</w:t>
+      </w:r>
+      <w:r>
+        <w:t xml:space="preserve"> in their literature</w:t>
+      </w:r>
+      <w:r>
+        <w:t xml:space="preserve"> by the authors</w:t>
+      </w:r>
+      <w:r>
+        <w:t xml:space="preserve"> or demarcations</w:t>
+      </w:r>
+      <w:r>
+        <w:t xml:space="preserve"> posted onto</w:t>
+      </w:r>
+      <w:r>
+        <w:t xml:space="preserve"> files within the</w:t>
+      </w:r>
+      <w:r>
+        <w:t xml:space="preserve"> GEO</w:t>
+      </w:r>
+      <w:r>
+        <w:t xml:space="preserve"> accession repository</w:t>
+      </w:r>
+      <w:r>
+        <w:t xml:space="preserve"> was</w:t>
+      </w:r>
+      <w:r>
+        <w:t xml:space="preserve"> left unedited</w:t>
+      </w:r>
+      <w:r>
+        <w:t>.</w:t>
+      </w:r>
+      <w:r>
+        <w:t xml:space="preserve"> </w:t>
+      </w:r>
+      <w:r>
+        <w:t>W</w:t>
+      </w:r>
+      <w:r>
+        <w:t>hile data that was undeclare</w:t>
+      </w:r>
+      <w:r>
+        <w:t>d or unclear</w:t>
+      </w:r>
+      <w:r>
+        <w:t xml:space="preserve"> to have gone through quality control was </w:t>
+      </w:r>
+      <w:r>
+        <w:t>subject</w:t>
+      </w:r>
+      <w:r>
+        <w:t>ed</w:t>
+      </w:r>
+      <w:r>
+        <w:t xml:space="preserve"> to manual thresholding of their unique feature count (</w:t>
+      </w:r>
+      <w:proofErr w:type="spellStart"/>
+      <w:r>
+        <w:t>nFeature</w:t>
+      </w:r>
+      <w:proofErr w:type="spellEnd"/>
+      <w:r>
+        <w:t>), their UMI count per cell (</w:t>
+      </w:r>
+      <w:proofErr w:type="spellStart"/>
+      <w:r>
+        <w:t>nCount</w:t>
+      </w:r>
+      <w:proofErr w:type="spellEnd"/>
+      <w:r>
+        <w:t>), and the percent of mitochondrial genes per cell with relevant visuals to estimate percentage of cells that would be kept or erased from the original dataset</w:t>
+      </w:r>
+      <w:r>
+        <w:t xml:space="preserve"> after applying Seurat sub</w:t>
+      </w:r>
+      <w:r>
+        <w:t>set</w:t>
+      </w:r>
+      <w:r>
+        <w:t xml:space="preserve"> function</w:t>
+      </w:r>
+      <w:r>
+        <w:t xml:space="preserve">. </w:t>
+      </w:r>
+      <w:r>
+        <w:t xml:space="preserve">Routine scatter plots were generated using </w:t>
+      </w:r>
+      <w:proofErr w:type="gramStart"/>
+      <w:r>
+        <w:t>Seurat::</w:t>
+      </w:r>
+      <w:proofErr w:type="spellStart"/>
+      <w:proofErr w:type="gramEnd"/>
+      <w:r>
+        <w:t>VlnPlot</w:t>
+      </w:r>
+      <w:proofErr w:type="spellEnd"/>
+      <w:r>
+        <w:t xml:space="preserve"> and </w:t>
+      </w:r>
+      <w:proofErr w:type="spellStart"/>
+      <w:r>
+        <w:t>FeatureScatter</w:t>
+      </w:r>
+      <w:proofErr w:type="spellEnd"/>
+      <w:r>
+        <w:t xml:space="preserve"> functions to show the relationship between transcriptional </w:t>
+      </w:r>
+      <w:proofErr w:type="gramStart"/>
+      <w:r>
+        <w:t>yield(</w:t>
+      </w:r>
+      <w:proofErr w:type="gramEnd"/>
+      <w:r>
+        <w:t>total detected RNA molecules/UMIs) and gene diversity (number of distinct genes detected) for each cell (log10(</w:t>
+      </w:r>
+      <w:proofErr w:type="spellStart"/>
+      <w:r>
+        <w:t>nCount</w:t>
+      </w:r>
+      <w:proofErr w:type="spellEnd"/>
+      <w:r>
+        <w:t xml:space="preserve"> + 1) vs log10(</w:t>
+      </w:r>
+      <w:proofErr w:type="spellStart"/>
+      <w:r>
+        <w:t>nFeature</w:t>
+      </w:r>
+      <w:proofErr w:type="spellEnd"/>
+      <w:r>
+        <w:t xml:space="preserve"> + 1)) visualized using </w:t>
+      </w:r>
+      <w:proofErr w:type="spellStart"/>
+      <w:r>
+        <w:t>ggplot</w:t>
+      </w:r>
+      <w:proofErr w:type="spellEnd"/>
+      <w:r>
+        <w:t xml:space="preserve"> and testing volume of droplets retained using potential thresholds.</w:t>
+      </w:r>
+    </w:p>
+    <w:p>
+      <w:pPr>
+        <w:rPr>
+          <w:b/>
+          <w:bCs/>
+        </w:rPr>
+      </w:pPr>
+      <w:r>
+        <w:rPr>
+          <w:b/>
+          <w:bCs/>
+        </w:rPr>
+        <w:t xml:space="preserve">How do QC thresholds differ across datasets or patients, and what does this variability imply for cross-sample comparisons? </w:t>
+      </w:r>
+    </w:p>
+    <w:p>
+      <w:pPr>
+        <w:rPr>
+          <w:b/>
+          <w:bCs/>
+        </w:rPr>
+      </w:pPr>
+      <w:r>
+        <w:rPr>
+          <w:b/>
+          <w:bCs/>
+        </w:rPr>
+        <w:t xml:space="preserve">QC </w:t>
+      </w:r>
+      <w:r>
+        <w:rPr>
+          <w:b/>
+          <w:bCs/>
+        </w:rPr>
+        <w:t>Result</w:t>
+      </w:r>
+      <w:r>
+        <w:rPr>
+          <w:b/>
+          <w:bCs/>
+        </w:rPr>
+        <w:t xml:space="preserve"> Section</w:t>
+      </w:r>
+      <w:r>
+        <w:rPr>
+          <w:b/>
+          <w:bCs/>
+        </w:rPr>
+        <w:t>:</w:t>
+      </w:r>
+    </w:p>
+    <w:p>
+      <w:pPr>
+        <w:rPr>
+          <w:b/>
+          <w:bCs/>
+        </w:rPr>
+      </w:pPr>
+      <w:r>
+        <w:t>The</w:t>
+      </w:r>
+      <w:r>
+        <w:t xml:space="preserve"> applied</w:t>
+      </w:r>
+      <w:r>
+        <w:t xml:space="preserve"> thresholds for the datasets</w:t>
+      </w:r>
+      <w:r>
+        <w:t xml:space="preserve"> that necessitated QC</w:t>
+      </w:r>
+      <w:r>
+        <w:t xml:space="preserve"> (GSE176031, and GSE181294) are shown in the table below.</w:t>
+      </w:r>
+      <w:r>
+        <w:t xml:space="preserve"> </w:t>
+      </w:r>
+      <w:r>
+        <w:t xml:space="preserve">The variation of the thresholds applied indicate the </w:t>
+      </w:r>
+      <w:r>
+        <w:t>different experimental preparations between the labs and</w:t>
+      </w:r>
+      <w:r>
+        <w:t xml:space="preserve"> their</w:t>
+      </w:r>
+      <w:r>
+        <w:t xml:space="preserve"> varying results</w:t>
+      </w:r>
+      <w:r>
+        <w:t>.</w:t>
+      </w:r>
+      <w:r>
+        <w:t xml:space="preserve"> For example,</w:t>
+      </w:r>
+      <w:r>
+        <w:t xml:space="preserve"> GSE176031 showed </w:t>
+      </w:r>
+      <w:r>
+        <w:t>many</w:t>
+      </w:r>
+      <w:r>
+        <w:t xml:space="preserve"> cells that exceeded 10% mitochondrial</w:t>
+      </w:r>
+      <w:r>
+        <w:t xml:space="preserve"> gene percentage per cell  (median = 7.24%, 95</w:t>
+      </w:r>
+      <w:r>
+        <w:rPr>
+          <w:vertAlign w:val="superscript"/>
+        </w:rPr>
+        <w:t>th</w:t>
+      </w:r>
+      <w:r>
+        <w:t>% = 56.7%)</w:t>
+      </w:r>
+      <w:r>
+        <w:t xml:space="preserve"> genes per cell</w:t>
+      </w:r>
+      <w:r>
+        <w:t xml:space="preserve"> while the GSE181294 </w:t>
       </w:r>
       <w:r>
         <w:lastRenderedPageBreak/>
-        <w:t>analysis on the perturbation of immune states paired normal adjacent and tumo</w:t>
-      </w:r>
-      <w:r>
-        <w:t xml:space="preserve">r biopsies </w:t>
-      </w:r>
-      <w:proofErr w:type="gramStart"/>
-      <w:r>
-        <w:t>so</w:t>
-      </w:r>
-      <w:proofErr w:type="gramEnd"/>
-      <w:r>
-        <w:t xml:space="preserve"> this one was avoided. Cell columns with non-unique genes within the count matrix were summed together to create the Seurat object, while non-unique barcodes from different libraries of the same dataset were marked with </w:t>
-      </w:r>
-      <w:proofErr w:type="gramStart"/>
-      <w:r>
-        <w:t>a .i</w:t>
-      </w:r>
-      <w:proofErr w:type="gramEnd"/>
-      <w:r>
-        <w:t>+1 if authors had not already marked their library barcodes between samples to preserve library complexity.</w:t>
-      </w:r>
-    </w:p>
-    <w:p>
-      <w:pPr>
-        <w:rPr>
-          <w:b/>
-          <w:bCs/>
-        </w:rPr>
-      </w:pPr>
-      <w:r>
-        <w:rPr>
-          <w:b/>
-          <w:bCs/>
-        </w:rPr>
-        <w:t xml:space="preserve">Dataset Cell </w:t>
-      </w:r>
-      <w:r>
-        <w:rPr>
-          <w:b/>
-          <w:bCs/>
-        </w:rPr>
-        <w:t>QC (Materials and Methods)</w:t>
-      </w:r>
-    </w:p>
-    <w:p>
-      <w:r>
-        <w:t>Each dataset was first screened using</w:t>
-      </w:r>
-      <w:r>
-        <w:t xml:space="preserve"> the</w:t>
+        <w:t>had minimal mitochondrial gene counts</w:t>
+      </w:r>
+      <w:r>
+        <w:t xml:space="preserve"> (</w:t>
+      </w:r>
+      <w:r>
+        <w:t>GRAB MEDIAN AND 95</w:t>
+      </w:r>
+      <w:r>
+        <w:rPr>
+          <w:vertAlign w:val="superscript"/>
+        </w:rPr>
+        <w:t>TH</w:t>
+      </w:r>
+      <w:r>
+        <w:t xml:space="preserve"> percentile of %Mito</w:t>
+      </w:r>
+      <w:r>
+        <w:t>)</w:t>
+      </w:r>
+      <w:r>
+        <w:t>.</w:t>
+      </w:r>
+      <w:r>
+        <w:t xml:space="preserve">This could be due to human error during preparation or the </w:t>
+      </w:r>
+      <w:r>
+        <w:t xml:space="preserve">observation </w:t>
+      </w:r>
+      <w:r>
+        <w:t>that one was prepared with</w:t>
+      </w:r>
+      <w:r>
+        <w:t xml:space="preserve"> two different single cell methods </w:t>
       </w:r>
       <w:r>
         <w:t xml:space="preserve"> </w:t>
       </w:r>
-      <w:proofErr w:type="spellStart"/>
-      <w:r>
-        <w:t>EmptyDroplets</w:t>
-      </w:r>
-      <w:proofErr w:type="spellEnd"/>
-      <w:r>
-        <w:t xml:space="preserve"> from </w:t>
-      </w:r>
-      <w:proofErr w:type="spellStart"/>
-      <w:r>
-        <w:t>DropletUtils</w:t>
-      </w:r>
-      <w:proofErr w:type="spellEnd"/>
-      <w:r>
-        <w:t xml:space="preserve"> [1, 2] and the </w:t>
-      </w:r>
-      <w:proofErr w:type="spellStart"/>
-      <w:r>
-        <w:t>DoubletFinder</w:t>
-      </w:r>
-      <w:proofErr w:type="spellEnd"/>
-      <w:r>
-        <w:t xml:space="preserve"> classifier [3] to determine </w:t>
-      </w:r>
-      <w:r>
-        <w:t xml:space="preserve">whether to what extent </w:t>
-      </w:r>
-      <w:r>
-        <w:t>manual</w:t>
-      </w:r>
-      <w:r>
-        <w:t xml:space="preserve"> filtering </w:t>
-      </w:r>
-      <w:r>
-        <w:t xml:space="preserve">thresholds would be applied to the </w:t>
-      </w:r>
-      <w:proofErr w:type="spellStart"/>
-      <w:r>
-        <w:t>nFeature</w:t>
-      </w:r>
-      <w:proofErr w:type="spellEnd"/>
-      <w:r>
-        <w:t xml:space="preserve"> and </w:t>
-      </w:r>
-      <w:proofErr w:type="spellStart"/>
-      <w:r>
-        <w:t>nCount</w:t>
-      </w:r>
-      <w:proofErr w:type="spellEnd"/>
+      <w:r>
+        <w:t>(Seq</w:t>
+      </w:r>
+      <w:r>
+        <w:t>-</w:t>
+      </w:r>
+      <w:r>
+        <w:t xml:space="preserve">Well vs 10x Chromium), but regardless the thresholds indicate that these datasets </w:t>
+      </w:r>
+      <w:r>
+        <w:t>exhibit distinct baseline distribution of transcript yield and quality</w:t>
+      </w:r>
+      <w:r>
+        <w:t>. This</w:t>
+      </w:r>
+      <w:r>
+        <w:t xml:space="preserve"> implies</w:t>
+      </w:r>
+      <w:r>
+        <w:t xml:space="preserve"> that these datasets are not directly comparable due to the different contexts of preparation.</w:t>
+      </w:r>
+      <w:r>
+        <w:t xml:space="preserve"> Consequently,</w:t>
+      </w:r>
       <w:r>
         <w:t xml:space="preserve"> </w:t>
       </w:r>
       <w:r>
-        <w:t>metrics after creating routine scatter plots</w:t>
-      </w:r>
-      <w:r>
-        <w:t>.</w:t>
-      </w:r>
-      <w:r>
-        <w:t xml:space="preserve"> </w:t>
-      </w:r>
-      <w:r>
-        <w:t>This process established expected proportions of doublets and empty droplets within the single-cell dat</w:t>
-      </w:r>
-      <w:r>
-        <w:t>a and inform the magnitude of the manual thresholds</w:t>
-      </w:r>
-      <w:r>
-        <w:t>. To answer if quality control was necessary within the acquired data</w:t>
-      </w:r>
-      <w:r>
-        <w:t>,</w:t>
-      </w:r>
-      <w:r>
-        <w:t xml:space="preserve"> each dataset </w:t>
-      </w:r>
-      <w:r>
-        <w:t>that was either stated to have been pre-processed</w:t>
-      </w:r>
-      <w:r>
-        <w:t xml:space="preserve"> in their literature</w:t>
-      </w:r>
-      <w:r>
-        <w:t xml:space="preserve"> by the authors</w:t>
-      </w:r>
-      <w:r>
-        <w:t xml:space="preserve"> or demarcations</w:t>
-      </w:r>
-      <w:r>
-        <w:t xml:space="preserve"> posted onto</w:t>
-      </w:r>
-      <w:r>
-        <w:t xml:space="preserve"> files within the</w:t>
-      </w:r>
-      <w:r>
-        <w:t xml:space="preserve"> GEO</w:t>
-      </w:r>
-      <w:r>
-        <w:t xml:space="preserve"> accession repository</w:t>
-      </w:r>
-      <w:r>
-        <w:t xml:space="preserve"> was</w:t>
-      </w:r>
-      <w:r>
-        <w:t xml:space="preserve"> left unedited</w:t>
-      </w:r>
-      <w:r>
-        <w:t>.</w:t>
-      </w:r>
-      <w:r>
-        <w:t xml:space="preserve"> </w:t>
-      </w:r>
-      <w:r>
-        <w:t>W</w:t>
-      </w:r>
-      <w:r>
-        <w:t>hile data that was undeclare</w:t>
-      </w:r>
-      <w:r>
-        <w:t>d or unclear</w:t>
-      </w:r>
-      <w:r>
-        <w:t xml:space="preserve"> to have gone through quality control was </w:t>
-      </w:r>
-      <w:r>
-        <w:t>subject</w:t>
-      </w:r>
-      <w:r>
-        <w:t>ed</w:t>
-      </w:r>
-      <w:r>
-        <w:t xml:space="preserve"> to manual thresholding of their unique feature count (</w:t>
-      </w:r>
-      <w:proofErr w:type="spellStart"/>
-      <w:r>
-        <w:t>nFeature</w:t>
-      </w:r>
-      <w:proofErr w:type="spellEnd"/>
-      <w:r>
-        <w:t>), their UMI count per cell (</w:t>
-      </w:r>
-      <w:proofErr w:type="spellStart"/>
-      <w:r>
-        <w:t>nCount</w:t>
-      </w:r>
-      <w:proofErr w:type="spellEnd"/>
-      <w:r>
-        <w:t>), and the percent of mitochondrial genes per cell with relevant visuals to estimate percentage of cells that would be kept or erased from the original dataset</w:t>
-      </w:r>
-      <w:r>
-        <w:t xml:space="preserve"> after applying Seurat sub</w:t>
-      </w:r>
-      <w:r>
-        <w:t>set</w:t>
-      </w:r>
-      <w:r>
-        <w:t xml:space="preserve"> function</w:t>
-      </w:r>
-      <w:r>
-        <w:t>.</w:t>
-      </w:r>
-    </w:p>
-    <w:p>
-      <w:pPr>
-        <w:rPr>
-          <w:b/>
-          <w:bCs/>
-        </w:rPr>
-      </w:pPr>
-      <w:r>
-        <w:rPr>
-          <w:b/>
-          <w:bCs/>
-        </w:rPr>
-        <w:t xml:space="preserve">QC </w:t>
-      </w:r>
-      <w:r>
-        <w:rPr>
-          <w:b/>
-          <w:bCs/>
-        </w:rPr>
-        <w:t>Result</w:t>
-      </w:r>
-      <w:r>
-        <w:rPr>
-          <w:b/>
-          <w:bCs/>
-        </w:rPr>
-        <w:t xml:space="preserve"> Section</w:t>
-      </w:r>
-      <w:r>
-        <w:rPr>
-          <w:b/>
-          <w:bCs/>
-        </w:rPr>
-        <w:t>:</w:t>
-      </w:r>
-    </w:p>
-    <w:p>
-      <w:pPr>
-        <w:rPr>
-          <w:b/>
-          <w:bCs/>
-        </w:rPr>
-      </w:pPr>
-      <w:r>
-        <w:rPr>
-          <w:b/>
-          <w:bCs/>
-        </w:rPr>
-        <w:t>How do QC thresholds differ across datasets or patients, and what does this variability imply for cross-sample comparisons?</w:t>
-      </w:r>
-      <w:r>
-        <w:rPr>
-          <w:b/>
-          <w:bCs/>
-        </w:rPr>
-        <w:t xml:space="preserve"> </w:t>
-      </w:r>
-    </w:p>
-    <w:p>
-      <w:pPr>
-        <w:rPr>
-          <w:b/>
-          <w:bCs/>
-        </w:rPr>
-      </w:pPr>
-      <w:r>
-        <w:rPr>
-          <w:b/>
-          <w:bCs/>
-        </w:rPr>
-        <w:t>Checklist: Produce each QC Plot and compare the thresholds before and after.</w:t>
-      </w:r>
-    </w:p>
-    <w:p>
-      <w:r>
-        <w:t>Each</w:t>
-      </w:r>
-      <w:r>
-        <w:t xml:space="preserve"> quality control</w:t>
-      </w:r>
-      <w:r>
-        <w:t xml:space="preserve"> threshold was decided on a per dataset basis depending on the magnitude of correction</w:t>
-      </w:r>
-      <w:r>
-        <w:t>s</w:t>
-      </w:r>
-      <w:r>
-        <w:t xml:space="preserve"> </w:t>
-      </w:r>
-      <w:r>
-        <w:t xml:space="preserve">inferred </w:t>
-      </w:r>
-      <w:r>
-        <w:t>from the screening functions (</w:t>
-      </w:r>
-      <w:proofErr w:type="spellStart"/>
-      <w:r>
-        <w:t>EmptyDroplets</w:t>
-      </w:r>
-      <w:proofErr w:type="spellEnd"/>
+        <w:t xml:space="preserve">downstream comparisons of these requires </w:t>
+      </w:r>
+      <w:r>
+        <w:t>signal consolidation</w:t>
+      </w:r>
       <w:r>
         <w:t xml:space="preserve">, </w:t>
       </w:r>
-      <w:proofErr w:type="spellStart"/>
-      <w:r>
-        <w:t>DoubletFinder</w:t>
-      </w:r>
-      <w:proofErr w:type="spellEnd"/>
-      <w:r>
-        <w:t>,</w:t>
-      </w:r>
-      <w:r>
-        <w:t xml:space="preserve"> and </w:t>
-      </w:r>
-      <w:proofErr w:type="spellStart"/>
-      <w:r>
-        <w:t>SoupX</w:t>
-      </w:r>
-      <w:proofErr w:type="spellEnd"/>
-      <w:r>
-        <w:t>)</w:t>
-      </w:r>
-      <w:r>
-        <w:t>. R</w:t>
-      </w:r>
-      <w:r>
-        <w:t>outine scatter plots</w:t>
-      </w:r>
-      <w:r>
-        <w:t xml:space="preserve"> were</w:t>
-      </w:r>
-      <w:r>
-        <w:t xml:space="preserve"> generated using </w:t>
-      </w:r>
-      <w:proofErr w:type="gramStart"/>
-      <w:r>
-        <w:t>Seurat</w:t>
-      </w:r>
-      <w:r>
-        <w:t>::</w:t>
-      </w:r>
-      <w:proofErr w:type="spellStart"/>
-      <w:proofErr w:type="gramEnd"/>
-      <w:r>
-        <w:t>VlnPlot</w:t>
-      </w:r>
-      <w:proofErr w:type="spellEnd"/>
-      <w:r>
-        <w:t xml:space="preserve"> and</w:t>
-      </w:r>
-      <w:r>
-        <w:t xml:space="preserve"> </w:t>
-      </w:r>
-      <w:proofErr w:type="spellStart"/>
-      <w:r>
-        <w:t>FeatureScatter</w:t>
-      </w:r>
-      <w:proofErr w:type="spellEnd"/>
-      <w:r>
-        <w:t xml:space="preserve"> </w:t>
-      </w:r>
-      <w:r>
-        <w:t xml:space="preserve">functions </w:t>
-      </w:r>
-      <w:r>
-        <w:t>to show the</w:t>
-      </w:r>
-      <w:r>
-        <w:t xml:space="preserve"> relationship between transcriptional </w:t>
-      </w:r>
-      <w:proofErr w:type="gramStart"/>
-      <w:r>
-        <w:t>yield(</w:t>
-      </w:r>
-      <w:proofErr w:type="gramEnd"/>
-      <w:r>
-        <w:t>total detected RNA molecules/UMIs)</w:t>
-      </w:r>
-      <w:r>
-        <w:t xml:space="preserve"> </w:t>
-      </w:r>
-      <w:r>
-        <w:t xml:space="preserve">and gene diversity (number of distinct genes detected) for each cell </w:t>
-      </w:r>
-      <w:r>
-        <w:t>(log10(</w:t>
-      </w:r>
-      <w:proofErr w:type="spellStart"/>
-      <w:r>
-        <w:t>nCount</w:t>
-      </w:r>
-      <w:proofErr w:type="spellEnd"/>
-      <w:r>
-        <w:t xml:space="preserve"> + 1) vs log10(</w:t>
-      </w:r>
-      <w:proofErr w:type="spellStart"/>
-      <w:r>
-        <w:t>nFeature</w:t>
-      </w:r>
-      <w:proofErr w:type="spellEnd"/>
-      <w:r>
-        <w:t xml:space="preserve"> + 1)) visualized using </w:t>
-      </w:r>
-      <w:proofErr w:type="spellStart"/>
-      <w:r>
-        <w:t>ggplot</w:t>
-      </w:r>
-      <w:proofErr w:type="spellEnd"/>
-      <w:r>
-        <w:t xml:space="preserve"> and</w:t>
-      </w:r>
-      <w:r>
-        <w:t xml:space="preserve"> testing volume of droplets retained using</w:t>
-      </w:r>
-      <w:r>
-        <w:t xml:space="preserve"> </w:t>
-      </w:r>
-      <w:r>
-        <w:t>potential thresholds</w:t>
-      </w:r>
-      <w:r>
-        <w:t>. The</w:t>
-      </w:r>
-      <w:r>
-        <w:t xml:space="preserve"> applied</w:t>
-      </w:r>
-      <w:r>
-        <w:t xml:space="preserve"> thresholds for the datasets</w:t>
-      </w:r>
-      <w:r>
-        <w:t xml:space="preserve"> that necessitated QC</w:t>
-      </w:r>
-      <w:r>
-        <w:t xml:space="preserve"> (GSE176031, and GSE181294) are shown in the table below.</w:t>
-      </w:r>
-      <w:r>
-        <w:t xml:space="preserve"> </w:t>
-      </w:r>
-      <w:r>
-        <w:t xml:space="preserve">The variation of the thresholds applied indicate the </w:t>
-      </w:r>
-      <w:r>
-        <w:t>different experimental preparations between the labs and</w:t>
-      </w:r>
-      <w:r>
-        <w:t xml:space="preserve"> their</w:t>
-      </w:r>
-      <w:r>
-        <w:t xml:space="preserve"> varying results</w:t>
-      </w:r>
-      <w:r>
-        <w:t>.</w:t>
-      </w:r>
-      <w:r>
-        <w:t xml:space="preserve"> For example,</w:t>
-      </w:r>
-      <w:r>
-        <w:t xml:space="preserve"> GSE176031 showed </w:t>
-      </w:r>
-      <w:r>
-        <w:t>many</w:t>
-      </w:r>
-      <w:r>
-        <w:t xml:space="preserve"> cells that exceeded 10% mitochondrial</w:t>
-      </w:r>
-      <w:r>
-        <w:t xml:space="preserve"> gene percentage per cell  (median = 7.24%, 95</w:t>
-      </w:r>
-      <w:r>
-        <w:rPr>
-          <w:vertAlign w:val="superscript"/>
-        </w:rPr>
-        <w:t>th</w:t>
-      </w:r>
-      <w:r>
-        <w:t xml:space="preserve">% = </w:t>
-      </w:r>
-      <w:r>
-        <w:lastRenderedPageBreak/>
-        <w:t>56.7%)</w:t>
-      </w:r>
-      <w:r>
-        <w:t xml:space="preserve"> genes per cell</w:t>
-      </w:r>
-      <w:r>
-        <w:t xml:space="preserve"> while the GSE181294 had minimal mitochondrial gene counts</w:t>
-      </w:r>
-      <w:r>
-        <w:t xml:space="preserve"> (</w:t>
-      </w:r>
-      <w:r>
-        <w:t>GRAB MEDIAN AND 95</w:t>
-      </w:r>
-      <w:r>
-        <w:rPr>
-          <w:vertAlign w:val="superscript"/>
-        </w:rPr>
-        <w:t>TH</w:t>
-      </w:r>
-      <w:r>
-        <w:t xml:space="preserve"> percentile of %Mito</w:t>
-      </w:r>
-      <w:r>
-        <w:t>)</w:t>
-      </w:r>
-      <w:r>
-        <w:t>.</w:t>
+      <w:r>
+        <w:t>batch correction</w:t>
+      </w:r>
+      <w:r>
+        <w:t>, and re-normalization</w:t>
+      </w:r>
+      <w:r>
+        <w:t xml:space="preserve"> would be required </w:t>
+      </w:r>
+      <w:r>
+        <w:t>to compare relative changes in gene expression between shared conditions</w:t>
+      </w:r>
+      <w:r>
+        <w:t xml:space="preserve"> across datasets</w:t>
+      </w:r>
+      <w:r>
+        <w:t xml:space="preserve"> (ex: Normal Adjacent, and Tumor Core).</w:t>
       </w:r>
     </w:p>
     <w:tbl>
@@ -2204,6 +2187,465 @@
     </w:p>
     <w:p>
       <w:pPr>
+        <w:rPr>
+          <w:rFonts w:ascii="Times New Roman" w:eastAsia="Times New Roman" w:hAnsi="Times New Roman" w:cs="Times New Roman"/>
+          <w:kern w:val="0"/>
+          <w14:ligatures w14:val="none"/>
+        </w:rPr>
+      </w:pPr>
+    </w:p>
+    <w:p>
+      <w:pPr>
+        <w:rPr>
+          <w:rFonts w:ascii="Times New Roman" w:eastAsia="Times New Roman" w:hAnsi="Times New Roman" w:cs="Times New Roman"/>
+          <w:kern w:val="0"/>
+          <w14:ligatures w14:val="none"/>
+        </w:rPr>
+      </w:pPr>
+      <w:r>
+        <w:rPr>
+          <w:rFonts w:ascii="Times New Roman" w:eastAsia="Times New Roman" w:hAnsi="Times New Roman" w:cs="Times New Roman"/>
+          <w:kern w:val="0"/>
+          <w14:ligatures w14:val="none"/>
+        </w:rPr>
+        <w:t xml:space="preserve">What is the advantage having this large volume of </w:t>
+      </w:r>
+      <w:proofErr w:type="spellStart"/>
+      <w:r>
+        <w:rPr>
+          <w:rFonts w:ascii="Times New Roman" w:eastAsia="Times New Roman" w:hAnsi="Times New Roman" w:cs="Times New Roman"/>
+          <w:kern w:val="0"/>
+          <w14:ligatures w14:val="none"/>
+        </w:rPr>
+        <w:t>QCed</w:t>
+      </w:r>
+      <w:proofErr w:type="spellEnd"/>
+      <w:r>
+        <w:rPr>
+          <w:rFonts w:ascii="Times New Roman" w:eastAsia="Times New Roman" w:hAnsi="Times New Roman" w:cs="Times New Roman"/>
+          <w:kern w:val="0"/>
+          <w14:ligatures w14:val="none"/>
+        </w:rPr>
+        <w:t xml:space="preserve"> single cell data? D1, D2, D</w:t>
+      </w:r>
+      <w:proofErr w:type="gramStart"/>
+      <w:r>
+        <w:rPr>
+          <w:rFonts w:ascii="Times New Roman" w:eastAsia="Times New Roman" w:hAnsi="Times New Roman" w:cs="Times New Roman"/>
+          <w:kern w:val="0"/>
+          <w14:ligatures w14:val="none"/>
+        </w:rPr>
+        <w:t>3,D</w:t>
+      </w:r>
+      <w:proofErr w:type="gramEnd"/>
+      <w:r>
+        <w:rPr>
+          <w:rFonts w:ascii="Times New Roman" w:eastAsia="Times New Roman" w:hAnsi="Times New Roman" w:cs="Times New Roman"/>
+          <w:kern w:val="0"/>
+          <w14:ligatures w14:val="none"/>
+        </w:rPr>
+        <w:t>4</w:t>
+      </w:r>
+    </w:p>
+    <w:p>
+      <w:pPr>
+        <w:rPr>
+          <w:rFonts w:ascii="Times New Roman" w:eastAsia="Times New Roman" w:hAnsi="Times New Roman" w:cs="Times New Roman"/>
+          <w:kern w:val="0"/>
+          <w14:ligatures w14:val="none"/>
+        </w:rPr>
+      </w:pPr>
+      <w:r>
+        <w:rPr>
+          <w:rFonts w:ascii="Times New Roman" w:eastAsia="Times New Roman" w:hAnsi="Times New Roman" w:cs="Times New Roman"/>
+          <w:kern w:val="0"/>
+          <w14:ligatures w14:val="none"/>
+        </w:rPr>
+        <w:t xml:space="preserve">What shouldn’t we do with data? </w:t>
+      </w:r>
+    </w:p>
+    <w:p>
+      <w:pPr>
+        <w:rPr>
+          <w:rFonts w:ascii="Times New Roman" w:eastAsia="Times New Roman" w:hAnsi="Times New Roman" w:cs="Times New Roman"/>
+          <w:kern w:val="0"/>
+          <w14:ligatures w14:val="none"/>
+        </w:rPr>
+      </w:pPr>
+      <w:r>
+        <w:rPr>
+          <w:rFonts w:ascii="Times New Roman" w:eastAsia="Times New Roman" w:hAnsi="Times New Roman" w:cs="Times New Roman"/>
+          <w:kern w:val="0"/>
+          <w14:ligatures w14:val="none"/>
+        </w:rPr>
+        <w:t xml:space="preserve">The next obvious thing with this data to do is to characterize the cell types that occur within each condition. However, performing integration between these 4 datasets is computationally expensive (Seurat object likely &gt; 16 GB after raw count merging + CCA + Normalization + Scaling +recalculated PCA + recalculated UMAP+ Clustering+ Feature Consensus) and we’d likely be running into </w:t>
+      </w:r>
+      <w:proofErr w:type="gramStart"/>
+      <w:r>
+        <w:rPr>
+          <w:rFonts w:ascii="Times New Roman" w:eastAsia="Times New Roman" w:hAnsi="Times New Roman" w:cs="Times New Roman"/>
+          <w:kern w:val="0"/>
+          <w14:ligatures w14:val="none"/>
+        </w:rPr>
+        <w:t>the ”big</w:t>
+      </w:r>
+      <w:proofErr w:type="gramEnd"/>
+      <w:r>
+        <w:rPr>
+          <w:rFonts w:ascii="Times New Roman" w:eastAsia="Times New Roman" w:hAnsi="Times New Roman" w:cs="Times New Roman"/>
+          <w:kern w:val="0"/>
+          <w14:ligatures w14:val="none"/>
+        </w:rPr>
+        <w:t xml:space="preserve"> goober” strategy </w:t>
+      </w:r>
+      <w:proofErr w:type="gramStart"/>
+      <w:r>
+        <w:rPr>
+          <w:rFonts w:ascii="Times New Roman" w:eastAsia="Times New Roman" w:hAnsi="Times New Roman" w:cs="Times New Roman"/>
+          <w:kern w:val="0"/>
+          <w14:ligatures w14:val="none"/>
+        </w:rPr>
+        <w:t>were</w:t>
+      </w:r>
+      <w:proofErr w:type="gramEnd"/>
+      <w:r>
+        <w:rPr>
+          <w:rFonts w:ascii="Times New Roman" w:eastAsia="Times New Roman" w:hAnsi="Times New Roman" w:cs="Times New Roman"/>
+          <w:kern w:val="0"/>
+          <w14:ligatures w14:val="none"/>
+        </w:rPr>
+        <w:t xml:space="preserve"> the </w:t>
+      </w:r>
+      <w:proofErr w:type="spellStart"/>
+      <w:r>
+        <w:rPr>
+          <w:rFonts w:ascii="Times New Roman" w:eastAsia="Times New Roman" w:hAnsi="Times New Roman" w:cs="Times New Roman"/>
+          <w:kern w:val="0"/>
+          <w14:ligatures w14:val="none"/>
+        </w:rPr>
+        <w:t>combersome</w:t>
+      </w:r>
+      <w:proofErr w:type="spellEnd"/>
+      <w:r>
+        <w:rPr>
+          <w:rFonts w:ascii="Times New Roman" w:eastAsia="Times New Roman" w:hAnsi="Times New Roman" w:cs="Times New Roman"/>
+          <w:kern w:val="0"/>
+          <w14:ligatures w14:val="none"/>
+        </w:rPr>
+        <w:t xml:space="preserve"> volume and weight time will out weight the utility of the object itself. Characterizing the big goober (D1 + D2 +D3 +D3) and </w:t>
+      </w:r>
+      <w:proofErr w:type="gramStart"/>
+      <w:r>
+        <w:rPr>
+          <w:rFonts w:ascii="Times New Roman" w:eastAsia="Times New Roman" w:hAnsi="Times New Roman" w:cs="Times New Roman"/>
+          <w:kern w:val="0"/>
+          <w14:ligatures w14:val="none"/>
+        </w:rPr>
+        <w:t>the their</w:t>
+      </w:r>
+      <w:proofErr w:type="gramEnd"/>
+      <w:r>
+        <w:rPr>
+          <w:rFonts w:ascii="Times New Roman" w:eastAsia="Times New Roman" w:hAnsi="Times New Roman" w:cs="Times New Roman"/>
+          <w:kern w:val="0"/>
+          <w14:ligatures w14:val="none"/>
+        </w:rPr>
+        <w:t xml:space="preserve"> separate entities will be very redundant but will only confirm biological variation vs dataset variation. However, that is not the end goal. The goal is </w:t>
+      </w:r>
+      <w:proofErr w:type="gramStart"/>
+      <w:r>
+        <w:rPr>
+          <w:rFonts w:ascii="Times New Roman" w:eastAsia="Times New Roman" w:hAnsi="Times New Roman" w:cs="Times New Roman"/>
+          <w:kern w:val="0"/>
+          <w14:ligatures w14:val="none"/>
+        </w:rPr>
+        <w:t>characterize</w:t>
+      </w:r>
+      <w:proofErr w:type="gramEnd"/>
+      <w:r>
+        <w:rPr>
+          <w:rFonts w:ascii="Times New Roman" w:eastAsia="Times New Roman" w:hAnsi="Times New Roman" w:cs="Times New Roman"/>
+          <w:kern w:val="0"/>
+          <w14:ligatures w14:val="none"/>
+        </w:rPr>
+        <w:t xml:space="preserve"> the TME with </w:t>
+      </w:r>
+      <w:r>
+        <w:rPr>
+          <w:rFonts w:ascii="Times New Roman" w:eastAsia="Times New Roman" w:hAnsi="Times New Roman" w:cs="Times New Roman"/>
+          <w:kern w:val="0"/>
+          <w14:ligatures w14:val="none"/>
+        </w:rPr>
+        <w:lastRenderedPageBreak/>
+        <w:t>clinical variables using the limited computational power available. Which means the best viable path is this.</w:t>
+      </w:r>
+    </w:p>
+    <w:p>
+      <w:pPr>
+        <w:numPr>
+          <w:ilvl w:val="0"/>
+          <w:numId w:val="3"/>
+        </w:numPr>
+        <w:rPr>
+          <w:rFonts w:ascii="Times New Roman" w:eastAsia="Times New Roman" w:hAnsi="Times New Roman" w:cs="Times New Roman"/>
+          <w:kern w:val="0"/>
+          <w14:ligatures w14:val="none"/>
+        </w:rPr>
+      </w:pPr>
+      <w:r>
+        <w:rPr>
+          <w:rFonts w:ascii="Times New Roman" w:eastAsia="Times New Roman" w:hAnsi="Times New Roman" w:cs="Times New Roman"/>
+          <w:kern w:val="0"/>
+          <w14:ligatures w14:val="none"/>
+        </w:rPr>
+        <w:t xml:space="preserve">1. Characterize the individual </w:t>
+      </w:r>
+      <w:proofErr w:type="spellStart"/>
+      <w:r>
+        <w:rPr>
+          <w:rFonts w:ascii="Times New Roman" w:eastAsia="Times New Roman" w:hAnsi="Times New Roman" w:cs="Times New Roman"/>
+          <w:kern w:val="0"/>
+          <w14:ligatures w14:val="none"/>
+        </w:rPr>
+        <w:t>datasets’</w:t>
+      </w:r>
+      <w:proofErr w:type="spellEnd"/>
+      <w:r>
+        <w:rPr>
+          <w:rFonts w:ascii="Times New Roman" w:eastAsia="Times New Roman" w:hAnsi="Times New Roman" w:cs="Times New Roman"/>
+          <w:kern w:val="0"/>
+          <w14:ligatures w14:val="none"/>
+        </w:rPr>
+        <w:t xml:space="preserve"> cell types for each condition</w:t>
+      </w:r>
+    </w:p>
+    <w:p>
+      <w:pPr>
+        <w:numPr>
+          <w:ilvl w:val="0"/>
+          <w:numId w:val="3"/>
+        </w:numPr>
+        <w:rPr>
+          <w:rFonts w:ascii="Times New Roman" w:eastAsia="Times New Roman" w:hAnsi="Times New Roman" w:cs="Times New Roman"/>
+          <w:kern w:val="0"/>
+          <w14:ligatures w14:val="none"/>
+        </w:rPr>
+      </w:pPr>
+      <w:r>
+        <w:rPr>
+          <w:rFonts w:ascii="Times New Roman" w:eastAsia="Times New Roman" w:hAnsi="Times New Roman" w:cs="Times New Roman"/>
+          <w:kern w:val="0"/>
+          <w14:ligatures w14:val="none"/>
+        </w:rPr>
+        <w:t xml:space="preserve">2. Use some kind of statistical association strategy to say that it’s significant that X cell type is correlated to X condition (essentially a meta-analysis after </w:t>
+      </w:r>
+      <w:proofErr w:type="spellStart"/>
+      <w:r>
+        <w:rPr>
+          <w:rFonts w:ascii="Times New Roman" w:eastAsia="Times New Roman" w:hAnsi="Times New Roman" w:cs="Times New Roman"/>
+          <w:kern w:val="0"/>
+          <w14:ligatures w14:val="none"/>
+        </w:rPr>
+        <w:t>FindMarkers</w:t>
+      </w:r>
+      <w:proofErr w:type="spellEnd"/>
+      <w:r>
+        <w:rPr>
+          <w:rFonts w:ascii="Times New Roman" w:eastAsia="Times New Roman" w:hAnsi="Times New Roman" w:cs="Times New Roman"/>
+          <w:kern w:val="0"/>
+          <w14:ligatures w14:val="none"/>
+        </w:rPr>
+        <w:t xml:space="preserve"> 1vsAll for a specific condition not a direct comparison)</w:t>
+      </w:r>
+    </w:p>
+    <w:p>
+      <w:pPr>
+        <w:numPr>
+          <w:ilvl w:val="1"/>
+          <w:numId w:val="3"/>
+        </w:numPr>
+        <w:rPr>
+          <w:rFonts w:ascii="Times New Roman" w:eastAsia="Times New Roman" w:hAnsi="Times New Roman" w:cs="Times New Roman"/>
+          <w:kern w:val="0"/>
+          <w14:ligatures w14:val="none"/>
+        </w:rPr>
+      </w:pPr>
+      <w:r>
+        <w:rPr>
+          <w:rFonts w:ascii="Times New Roman" w:eastAsia="Times New Roman" w:hAnsi="Times New Roman" w:cs="Times New Roman"/>
+          <w:kern w:val="0"/>
+          <w14:ligatures w14:val="none"/>
+        </w:rPr>
+        <w:t>Possible Visuals: separate Dataset based Heatmaps of cell markers</w:t>
+      </w:r>
+    </w:p>
+    <w:p>
+      <w:pPr>
+        <w:numPr>
+          <w:ilvl w:val="1"/>
+          <w:numId w:val="3"/>
+        </w:numPr>
+        <w:rPr>
+          <w:rFonts w:ascii="Times New Roman" w:eastAsia="Times New Roman" w:hAnsi="Times New Roman" w:cs="Times New Roman"/>
+          <w:kern w:val="0"/>
+          <w14:ligatures w14:val="none"/>
+        </w:rPr>
+      </w:pPr>
+      <w:r>
+        <w:rPr>
+          <w:rFonts w:ascii="Times New Roman" w:eastAsia="Times New Roman" w:hAnsi="Times New Roman" w:cs="Times New Roman"/>
+          <w:kern w:val="0"/>
+          <w14:ligatures w14:val="none"/>
+        </w:rPr>
+        <w:t xml:space="preserve">Meta analysis per condition across each dataset </w:t>
+      </w:r>
+    </w:p>
+    <w:p>
+      <w:pPr>
+        <w:numPr>
+          <w:ilvl w:val="0"/>
+          <w:numId w:val="3"/>
+        </w:numPr>
+        <w:rPr>
+          <w:rFonts w:ascii="Times New Roman" w:eastAsia="Times New Roman" w:hAnsi="Times New Roman" w:cs="Times New Roman"/>
+          <w:kern w:val="0"/>
+          <w14:ligatures w14:val="none"/>
+        </w:rPr>
+      </w:pPr>
+      <w:r>
+        <w:rPr>
+          <w:rFonts w:ascii="Times New Roman" w:eastAsia="Times New Roman" w:hAnsi="Times New Roman" w:cs="Times New Roman"/>
+          <w:kern w:val="0"/>
+          <w14:ligatures w14:val="none"/>
+        </w:rPr>
+        <w:t xml:space="preserve">3. Do the same thing with the cell type and the clinical variable available within the </w:t>
+      </w:r>
+      <w:proofErr w:type="spellStart"/>
+      <w:r>
+        <w:rPr>
+          <w:rFonts w:ascii="Times New Roman" w:eastAsia="Times New Roman" w:hAnsi="Times New Roman" w:cs="Times New Roman"/>
+          <w:kern w:val="0"/>
+          <w14:ligatures w14:val="none"/>
+        </w:rPr>
+        <w:t>sc</w:t>
+      </w:r>
+      <w:proofErr w:type="spellEnd"/>
+      <w:r>
+        <w:rPr>
+          <w:rFonts w:ascii="Times New Roman" w:eastAsia="Times New Roman" w:hAnsi="Times New Roman" w:cs="Times New Roman"/>
+          <w:kern w:val="0"/>
+          <w14:ligatures w14:val="none"/>
+        </w:rPr>
+        <w:t xml:space="preserve"> metadata</w:t>
+      </w:r>
+    </w:p>
+    <w:p>
+      <w:pPr>
+        <w:numPr>
+          <w:ilvl w:val="0"/>
+          <w:numId w:val="3"/>
+        </w:numPr>
+        <w:rPr>
+          <w:rFonts w:ascii="Times New Roman" w:eastAsia="Times New Roman" w:hAnsi="Times New Roman" w:cs="Times New Roman"/>
+          <w:kern w:val="0"/>
+          <w14:ligatures w14:val="none"/>
+        </w:rPr>
+      </w:pPr>
+      <w:r>
+        <w:rPr>
+          <w:rFonts w:ascii="Times New Roman" w:eastAsia="Times New Roman" w:hAnsi="Times New Roman" w:cs="Times New Roman"/>
+          <w:kern w:val="0"/>
+          <w14:ligatures w14:val="none"/>
+        </w:rPr>
+        <w:t>4 Perform multi-reference deconvolution on bulk-</w:t>
+      </w:r>
+      <w:proofErr w:type="spellStart"/>
+      <w:r>
+        <w:rPr>
+          <w:rFonts w:ascii="Times New Roman" w:eastAsia="Times New Roman" w:hAnsi="Times New Roman" w:cs="Times New Roman"/>
+          <w:kern w:val="0"/>
+          <w14:ligatures w14:val="none"/>
+        </w:rPr>
+        <w:t>RNASeq</w:t>
+      </w:r>
+      <w:proofErr w:type="spellEnd"/>
+      <w:r>
+        <w:rPr>
+          <w:rFonts w:ascii="Times New Roman" w:eastAsia="Times New Roman" w:hAnsi="Times New Roman" w:cs="Times New Roman"/>
+          <w:kern w:val="0"/>
+          <w14:ligatures w14:val="none"/>
+        </w:rPr>
+        <w:t xml:space="preserve"> dataset</w:t>
+      </w:r>
+    </w:p>
+    <w:p>
+      <w:pPr>
+        <w:numPr>
+          <w:ilvl w:val="0"/>
+          <w:numId w:val="3"/>
+        </w:numPr>
+        <w:rPr>
+          <w:rFonts w:ascii="Times New Roman" w:eastAsia="Times New Roman" w:hAnsi="Times New Roman" w:cs="Times New Roman"/>
+          <w:kern w:val="0"/>
+          <w14:ligatures w14:val="none"/>
+        </w:rPr>
+      </w:pPr>
+      <w:r>
+        <w:rPr>
+          <w:rFonts w:ascii="Times New Roman" w:eastAsia="Times New Roman" w:hAnsi="Times New Roman" w:cs="Times New Roman"/>
+          <w:kern w:val="0"/>
+          <w14:ligatures w14:val="none"/>
+        </w:rPr>
+        <w:t xml:space="preserve">5. Use the cell </w:t>
+      </w:r>
+      <w:proofErr w:type="gramStart"/>
+      <w:r>
+        <w:rPr>
+          <w:rFonts w:ascii="Times New Roman" w:eastAsia="Times New Roman" w:hAnsi="Times New Roman" w:cs="Times New Roman"/>
+          <w:kern w:val="0"/>
+          <w14:ligatures w14:val="none"/>
+        </w:rPr>
+        <w:t>type  x</w:t>
+      </w:r>
+      <w:proofErr w:type="gramEnd"/>
+      <w:r>
+        <w:rPr>
+          <w:rFonts w:ascii="Times New Roman" w:eastAsia="Times New Roman" w:hAnsi="Times New Roman" w:cs="Times New Roman"/>
+          <w:kern w:val="0"/>
+          <w14:ligatures w14:val="none"/>
+        </w:rPr>
+        <w:t xml:space="preserve"> proportion matrix to figure out which change in cell types within the </w:t>
+      </w:r>
+      <w:proofErr w:type="spellStart"/>
+      <w:r>
+        <w:rPr>
+          <w:rFonts w:ascii="Times New Roman" w:eastAsia="Times New Roman" w:hAnsi="Times New Roman" w:cs="Times New Roman"/>
+          <w:kern w:val="0"/>
+          <w14:ligatures w14:val="none"/>
+        </w:rPr>
+        <w:t>bulkRNA</w:t>
+      </w:r>
+      <w:proofErr w:type="spellEnd"/>
+      <w:r>
+        <w:rPr>
+          <w:rFonts w:ascii="Times New Roman" w:eastAsia="Times New Roman" w:hAnsi="Times New Roman" w:cs="Times New Roman"/>
+          <w:kern w:val="0"/>
+          <w14:ligatures w14:val="none"/>
+        </w:rPr>
+        <w:t>-Seq data set and the tied meta data clinical variables.</w:t>
+      </w:r>
+    </w:p>
+    <w:p>
+      <w:pPr>
+        <w:rPr>
+          <w:rFonts w:ascii="Times New Roman" w:eastAsia="Times New Roman" w:hAnsi="Times New Roman" w:cs="Times New Roman"/>
+          <w:kern w:val="0"/>
+          <w14:ligatures w14:val="none"/>
+        </w:rPr>
+      </w:pPr>
+    </w:p>
+    <w:p>
+      <w:pPr>
         <w:pStyle w:val="NormalWeb"/>
       </w:pPr>
     </w:p>
@@ -2313,6 +2755,145 @@
     </w:lvl>
   </w:abstractNum>
   <w:abstractNum w:abstractNumId="1" w15:restartNumberingAfterBreak="0">
+    <w:nsid w:val="21416B6E"/>
+    <w:multiLevelType w:val="hybridMultilevel"/>
+    <w:tmpl w:val="42C27F3E"/>
+    <w:lvl w:ilvl="0" w:tplc="DD0A48F6">
+      <w:start w:val="1"/>
+      <w:numFmt w:val="bullet"/>
+      <w:lvlText w:val="•"/>
+      <w:lvlJc w:val="left"/>
+      <w:pPr>
+        <w:tabs>
+          <w:tab w:val="num" w:pos="720"/>
+        </w:tabs>
+        <w:ind w:left="720" w:hanging="360"/>
+      </w:pPr>
+      <w:rPr>
+        <w:rFonts w:ascii="Arial" w:hAnsi="Arial" w:hint="default"/>
+      </w:rPr>
+    </w:lvl>
+    <w:lvl w:ilvl="1" w:tplc="99B43C4C">
+      <w:numFmt w:val="bullet"/>
+      <w:lvlText w:val="•"/>
+      <w:lvlJc w:val="left"/>
+      <w:pPr>
+        <w:tabs>
+          <w:tab w:val="num" w:pos="1440"/>
+        </w:tabs>
+        <w:ind w:left="1440" w:hanging="360"/>
+      </w:pPr>
+      <w:rPr>
+        <w:rFonts w:ascii="Arial" w:hAnsi="Arial" w:hint="default"/>
+      </w:rPr>
+    </w:lvl>
+    <w:lvl w:ilvl="2" w:tplc="C2B409FA" w:tentative="1">
+      <w:start w:val="1"/>
+      <w:numFmt w:val="bullet"/>
+      <w:lvlText w:val="•"/>
+      <w:lvlJc w:val="left"/>
+      <w:pPr>
+        <w:tabs>
+          <w:tab w:val="num" w:pos="2160"/>
+        </w:tabs>
+        <w:ind w:left="2160" w:hanging="360"/>
+      </w:pPr>
+      <w:rPr>
+        <w:rFonts w:ascii="Arial" w:hAnsi="Arial" w:hint="default"/>
+      </w:rPr>
+    </w:lvl>
+    <w:lvl w:ilvl="3" w:tplc="388237F4" w:tentative="1">
+      <w:start w:val="1"/>
+      <w:numFmt w:val="bullet"/>
+      <w:lvlText w:val="•"/>
+      <w:lvlJc w:val="left"/>
+      <w:pPr>
+        <w:tabs>
+          <w:tab w:val="num" w:pos="2880"/>
+        </w:tabs>
+        <w:ind w:left="2880" w:hanging="360"/>
+      </w:pPr>
+      <w:rPr>
+        <w:rFonts w:ascii="Arial" w:hAnsi="Arial" w:hint="default"/>
+      </w:rPr>
+    </w:lvl>
+    <w:lvl w:ilvl="4" w:tplc="0A56EA80" w:tentative="1">
+      <w:start w:val="1"/>
+      <w:numFmt w:val="bullet"/>
+      <w:lvlText w:val="•"/>
+      <w:lvlJc w:val="left"/>
+      <w:pPr>
+        <w:tabs>
+          <w:tab w:val="num" w:pos="3600"/>
+        </w:tabs>
+        <w:ind w:left="3600" w:hanging="360"/>
+      </w:pPr>
+      <w:rPr>
+        <w:rFonts w:ascii="Arial" w:hAnsi="Arial" w:hint="default"/>
+      </w:rPr>
+    </w:lvl>
+    <w:lvl w:ilvl="5" w:tplc="BB4040C0" w:tentative="1">
+      <w:start w:val="1"/>
+      <w:numFmt w:val="bullet"/>
+      <w:lvlText w:val="•"/>
+      <w:lvlJc w:val="left"/>
+      <w:pPr>
+        <w:tabs>
+          <w:tab w:val="num" w:pos="4320"/>
+        </w:tabs>
+        <w:ind w:left="4320" w:hanging="360"/>
+      </w:pPr>
+      <w:rPr>
+        <w:rFonts w:ascii="Arial" w:hAnsi="Arial" w:hint="default"/>
+      </w:rPr>
+    </w:lvl>
+    <w:lvl w:ilvl="6" w:tplc="7382AB96" w:tentative="1">
+      <w:start w:val="1"/>
+      <w:numFmt w:val="bullet"/>
+      <w:lvlText w:val="•"/>
+      <w:lvlJc w:val="left"/>
+      <w:pPr>
+        <w:tabs>
+          <w:tab w:val="num" w:pos="5040"/>
+        </w:tabs>
+        <w:ind w:left="5040" w:hanging="360"/>
+      </w:pPr>
+      <w:rPr>
+        <w:rFonts w:ascii="Arial" w:hAnsi="Arial" w:hint="default"/>
+      </w:rPr>
+    </w:lvl>
+    <w:lvl w:ilvl="7" w:tplc="105AA18A" w:tentative="1">
+      <w:start w:val="1"/>
+      <w:numFmt w:val="bullet"/>
+      <w:lvlText w:val="•"/>
+      <w:lvlJc w:val="left"/>
+      <w:pPr>
+        <w:tabs>
+          <w:tab w:val="num" w:pos="5760"/>
+        </w:tabs>
+        <w:ind w:left="5760" w:hanging="360"/>
+      </w:pPr>
+      <w:rPr>
+        <w:rFonts w:ascii="Arial" w:hAnsi="Arial" w:hint="default"/>
+      </w:rPr>
+    </w:lvl>
+    <w:lvl w:ilvl="8" w:tplc="C2BE6C76" w:tentative="1">
+      <w:start w:val="1"/>
+      <w:numFmt w:val="bullet"/>
+      <w:lvlText w:val="•"/>
+      <w:lvlJc w:val="left"/>
+      <w:pPr>
+        <w:tabs>
+          <w:tab w:val="num" w:pos="6480"/>
+        </w:tabs>
+        <w:ind w:left="6480" w:hanging="360"/>
+      </w:pPr>
+      <w:rPr>
+        <w:rFonts w:ascii="Arial" w:hAnsi="Arial" w:hint="default"/>
+      </w:rPr>
+    </w:lvl>
+  </w:abstractNum>
+  <w:abstractNum w:abstractNumId="2" w15:restartNumberingAfterBreak="0">
     <w:nsid w:val="57410E7E"/>
     <w:multiLevelType w:val="hybridMultilevel"/>
     <w:tmpl w:val="D1E0371E"/>
@@ -2405,6 +2986,9 @@
     <w:abstractNumId w:val="0"/>
   </w:num>
   <w:num w:numId="2" w16cid:durableId="919100901">
+    <w:abstractNumId w:val="2"/>
+  </w:num>
+  <w:num w:numId="3" w16cid:durableId="807820510">
     <w:abstractNumId w:val="1"/>
   </w:num>
 </w:numbering>
@@ -3013,7 +3597,6 @@
   <w:style w:type="character" w:default="1" w:styleId="DefaultParagraphFont">
     <w:name w:val="Default Paragraph Font"/>
     <w:uiPriority w:val="1"/>
-    <w:semiHidden/>
     <w:unhideWhenUsed/>
   </w:style>
   <w:style w:type="table" w:default="1" w:styleId="TableNormal">

</xml_diff>